<commit_message>
docs: cover page now has 4 governors horizontal + chairperson photo below
Page 1 reorganised: 4 logos in header, title, 4 governor photos in a
horizontal 1x4 strip, then a centred IT Chairperson photo placeholder
below, then topic 1 bullets and lead text. PDF and Word kept in sync.
</commit_message>
<xml_diff>
--- a/docs/A19_IT_CHAIRPERSON_DECK.docx
+++ b/docs/A19_IT_CHAIRPERSON_DECK.docx
@@ -231,6 +231,442 @@
       </w:tr>
     </w:tbl>
     <w:p>
+      <w:r>
+        <w:rPr>
+          <w:rFonts w:ascii="Calibri" w:hAnsi="Calibri"/>
+          <w:b/>
+          <w:i w:val="0"/>
+          <w:color w:val="003F87"/>
+          <w:sz w:val="26"/>
+        </w:rPr>
+        <w:t>Leadership · 2025–26</w:t>
+      </w:r>
+    </w:p>
+    <w:tbl>
+      <w:tblPr>
+        <w:tblW w:type="auto" w:w="0"/>
+        <w:tblLayout w:type="fixed"/>
+        <w:tblLook w:firstColumn="1" w:firstRow="1" w:lastColumn="0" w:lastRow="0" w:noHBand="0" w:noVBand="1" w:val="04A0"/>
+      </w:tblPr>
+      <w:tblGrid>
+        <w:gridCol w:w="3535"/>
+        <w:gridCol w:w="3535"/>
+        <w:gridCol w:w="3535"/>
+        <w:gridCol w:w="3535"/>
+      </w:tblGrid>
+      <w:tr>
+        <w:trPr>
+          <w:trHeight w:val="2551"/>
+        </w:trPr>
+        <w:tc>
+          <w:tcPr>
+            <w:tcW w:type="dxa" w:w="3543"/>
+            <w:shd w:val="clear" w:color="auto" w:fill="F4F6FA"/>
+            <w:tcBorders>
+              <w:top w:val="single" w:sz="10" w:color="003F87"/>
+              <w:left w:val="single" w:sz="10" w:color="003F87"/>
+              <w:bottom w:val="single" w:sz="10" w:color="003F87"/>
+              <w:right w:val="single" w:sz="10" w:color="003F87"/>
+            </w:tcBorders>
+            <w:vAlign w:val="center"/>
+          </w:tcPr>
+          <w:p>
+            <w:pPr>
+              <w:jc w:val="left"/>
+            </w:pPr>
+            <w:r>
+              <w:rPr>
+                <w:rFonts w:ascii="Calibri" w:hAnsi="Calibri"/>
+                <w:b/>
+                <w:i w:val="0"/>
+                <w:color w:val="003F87"/>
+                <w:sz w:val="18"/>
+              </w:rPr>
+              <w:t xml:space="preserve"> GOV 1 </w:t>
+            </w:r>
+          </w:p>
+          <w:p>
+            <w:pPr>
+              <w:jc w:val="center"/>
+            </w:pPr>
+            <w:r>
+              <w:rPr>
+                <w:rFonts w:ascii="Calibri" w:hAnsi="Calibri"/>
+                <w:b w:val="0"/>
+                <w:i/>
+                <w:color w:val="2B2B2B"/>
+                <w:sz w:val="20"/>
+              </w:rPr>
+              <w:t>[ Insert Photo ]</w:t>
+            </w:r>
+          </w:p>
+          <w:p>
+            <w:pPr>
+              <w:jc w:val="center"/>
+            </w:pPr>
+            <w:r>
+              <w:rPr>
+                <w:rFonts w:ascii="Calibri" w:hAnsi="Calibri"/>
+                <w:b/>
+                <w:i w:val="0"/>
+                <w:color w:val="003F87"/>
+                <w:sz w:val="22"/>
+              </w:rPr>
+              <w:t>Int'l President</w:t>
+            </w:r>
+          </w:p>
+          <w:p>
+            <w:pPr>
+              <w:jc w:val="center"/>
+            </w:pPr>
+            <w:r>
+              <w:rPr>
+                <w:rFonts w:ascii="Calibri" w:hAnsi="Calibri"/>
+                <w:b w:val="0"/>
+                <w:i/>
+                <w:color w:val="2B2B2B"/>
+                <w:sz w:val="18"/>
+              </w:rPr>
+              <w:t>Lions International</w:t>
+            </w:r>
+          </w:p>
+        </w:tc>
+        <w:tc>
+          <w:tcPr>
+            <w:tcW w:type="dxa" w:w="3543"/>
+            <w:shd w:val="clear" w:color="auto" w:fill="F4F6FA"/>
+            <w:tcBorders>
+              <w:top w:val="single" w:sz="10" w:color="003F87"/>
+              <w:left w:val="single" w:sz="10" w:color="003F87"/>
+              <w:bottom w:val="single" w:sz="10" w:color="003F87"/>
+              <w:right w:val="single" w:sz="10" w:color="003F87"/>
+            </w:tcBorders>
+            <w:vAlign w:val="center"/>
+          </w:tcPr>
+          <w:p>
+            <w:pPr>
+              <w:jc w:val="left"/>
+            </w:pPr>
+            <w:r>
+              <w:rPr>
+                <w:rFonts w:ascii="Calibri" w:hAnsi="Calibri"/>
+                <w:b/>
+                <w:i w:val="0"/>
+                <w:color w:val="003F87"/>
+                <w:sz w:val="18"/>
+              </w:rPr>
+              <w:t xml:space="preserve"> GOV 2 </w:t>
+            </w:r>
+          </w:p>
+          <w:p>
+            <w:pPr>
+              <w:jc w:val="center"/>
+            </w:pPr>
+            <w:r>
+              <w:rPr>
+                <w:rFonts w:ascii="Calibri" w:hAnsi="Calibri"/>
+                <w:b w:val="0"/>
+                <w:i/>
+                <w:color w:val="2B2B2B"/>
+                <w:sz w:val="20"/>
+              </w:rPr>
+              <w:t>[ Insert Photo ]</w:t>
+            </w:r>
+          </w:p>
+          <w:p>
+            <w:pPr>
+              <w:jc w:val="center"/>
+            </w:pPr>
+            <w:r>
+              <w:rPr>
+                <w:rFonts w:ascii="Calibri" w:hAnsi="Calibri"/>
+                <w:b/>
+                <w:i w:val="0"/>
+                <w:color w:val="003F87"/>
+                <w:sz w:val="22"/>
+              </w:rPr>
+              <w:t>Council Chair</w:t>
+            </w:r>
+          </w:p>
+          <w:p>
+            <w:pPr>
+              <w:jc w:val="center"/>
+            </w:pPr>
+            <w:r>
+              <w:rPr>
+                <w:rFonts w:ascii="Calibri" w:hAnsi="Calibri"/>
+                <w:b w:val="0"/>
+                <w:i/>
+                <w:color w:val="2B2B2B"/>
+                <w:sz w:val="18"/>
+              </w:rPr>
+              <w:t>Multiple District 3232</w:t>
+            </w:r>
+          </w:p>
+        </w:tc>
+        <w:tc>
+          <w:tcPr>
+            <w:tcW w:type="dxa" w:w="3543"/>
+            <w:shd w:val="clear" w:color="auto" w:fill="F4F6FA"/>
+            <w:tcBorders>
+              <w:top w:val="single" w:sz="10" w:color="003F87"/>
+              <w:left w:val="single" w:sz="10" w:color="003F87"/>
+              <w:bottom w:val="single" w:sz="10" w:color="003F87"/>
+              <w:right w:val="single" w:sz="10" w:color="003F87"/>
+            </w:tcBorders>
+            <w:vAlign w:val="center"/>
+          </w:tcPr>
+          <w:p>
+            <w:pPr>
+              <w:jc w:val="left"/>
+            </w:pPr>
+            <w:r>
+              <w:rPr>
+                <w:rFonts w:ascii="Calibri" w:hAnsi="Calibri"/>
+                <w:b/>
+                <w:i w:val="0"/>
+                <w:color w:val="003F87"/>
+                <w:sz w:val="18"/>
+              </w:rPr>
+              <w:t xml:space="preserve"> GOV 3 </w:t>
+            </w:r>
+          </w:p>
+          <w:p>
+            <w:pPr>
+              <w:jc w:val="center"/>
+            </w:pPr>
+            <w:r>
+              <w:rPr>
+                <w:rFonts w:ascii="Calibri" w:hAnsi="Calibri"/>
+                <w:b w:val="0"/>
+                <w:i/>
+                <w:color w:val="2B2B2B"/>
+                <w:sz w:val="20"/>
+              </w:rPr>
+              <w:t>[ Insert Photo ]</w:t>
+            </w:r>
+          </w:p>
+          <w:p>
+            <w:pPr>
+              <w:jc w:val="center"/>
+            </w:pPr>
+            <w:r>
+              <w:rPr>
+                <w:rFonts w:ascii="Calibri" w:hAnsi="Calibri"/>
+                <w:b/>
+                <w:i w:val="0"/>
+                <w:color w:val="003F87"/>
+                <w:sz w:val="22"/>
+              </w:rPr>
+              <w:t>District Governor</w:t>
+            </w:r>
+          </w:p>
+          <w:p>
+            <w:pPr>
+              <w:jc w:val="center"/>
+            </w:pPr>
+            <w:r>
+              <w:rPr>
+                <w:rFonts w:ascii="Calibri" w:hAnsi="Calibri"/>
+                <w:b w:val="0"/>
+                <w:i/>
+                <w:color w:val="2B2B2B"/>
+                <w:sz w:val="18"/>
+              </w:rPr>
+              <w:t>District 3232F1</w:t>
+            </w:r>
+          </w:p>
+        </w:tc>
+        <w:tc>
+          <w:tcPr>
+            <w:tcW w:type="dxa" w:w="3543"/>
+            <w:shd w:val="clear" w:color="auto" w:fill="F4F6FA"/>
+            <w:tcBorders>
+              <w:top w:val="single" w:sz="10" w:color="003F87"/>
+              <w:left w:val="single" w:sz="10" w:color="003F87"/>
+              <w:bottom w:val="single" w:sz="10" w:color="003F87"/>
+              <w:right w:val="single" w:sz="10" w:color="003F87"/>
+            </w:tcBorders>
+            <w:vAlign w:val="center"/>
+          </w:tcPr>
+          <w:p>
+            <w:pPr>
+              <w:jc w:val="left"/>
+            </w:pPr>
+            <w:r>
+              <w:rPr>
+                <w:rFonts w:ascii="Calibri" w:hAnsi="Calibri"/>
+                <w:b/>
+                <w:i w:val="0"/>
+                <w:color w:val="003F87"/>
+                <w:sz w:val="18"/>
+              </w:rPr>
+              <w:t xml:space="preserve"> GOV 4 </w:t>
+            </w:r>
+          </w:p>
+          <w:p>
+            <w:pPr>
+              <w:jc w:val="center"/>
+            </w:pPr>
+            <w:r>
+              <w:rPr>
+                <w:rFonts w:ascii="Calibri" w:hAnsi="Calibri"/>
+                <w:b w:val="0"/>
+                <w:i/>
+                <w:color w:val="2B2B2B"/>
+                <w:sz w:val="20"/>
+              </w:rPr>
+              <w:t>[ Insert Photo ]</w:t>
+            </w:r>
+          </w:p>
+          <w:p>
+            <w:pPr>
+              <w:jc w:val="center"/>
+            </w:pPr>
+            <w:r>
+              <w:rPr>
+                <w:rFonts w:ascii="Calibri" w:hAnsi="Calibri"/>
+                <w:b/>
+                <w:i w:val="0"/>
+                <w:color w:val="003F87"/>
+                <w:sz w:val="22"/>
+              </w:rPr>
+              <w:t>IPDG / VDG</w:t>
+            </w:r>
+          </w:p>
+          <w:p>
+            <w:pPr>
+              <w:jc w:val="center"/>
+            </w:pPr>
+            <w:r>
+              <w:rPr>
+                <w:rFonts w:ascii="Calibri" w:hAnsi="Calibri"/>
+                <w:b w:val="0"/>
+                <w:i/>
+                <w:color w:val="2B2B2B"/>
+                <w:sz w:val="18"/>
+              </w:rPr>
+              <w:t>District 3232F1</w:t>
+            </w:r>
+          </w:p>
+        </w:tc>
+      </w:tr>
+    </w:tbl>
+    <w:p>
+      <w:r>
+        <w:rPr>
+          <w:rFonts w:ascii="Calibri" w:hAnsi="Calibri"/>
+          <w:b/>
+          <w:i w:val="0"/>
+          <w:color w:val="003F87"/>
+          <w:sz w:val="26"/>
+        </w:rPr>
+        <w:t>District IT Chairperson · 2025–26</w:t>
+      </w:r>
+    </w:p>
+    <w:tbl>
+      <w:tblPr>
+        <w:tblW w:type="auto" w:w="0"/>
+        <w:tblLayout w:type="fixed"/>
+        <w:tblLook w:firstColumn="1" w:firstRow="1" w:lastColumn="0" w:lastRow="0" w:noHBand="0" w:noVBand="1" w:val="04A0"/>
+      </w:tblPr>
+      <w:tblGrid>
+        <w:gridCol w:w="4713"/>
+        <w:gridCol w:w="4713"/>
+        <w:gridCol w:w="4713"/>
+      </w:tblGrid>
+      <w:tr>
+        <w:trPr>
+          <w:trHeight w:val="2835"/>
+        </w:trPr>
+        <w:tc>
+          <w:tcPr>
+            <w:tcW w:type="dxa" w:w="4252"/>
+          </w:tcPr>
+          <w:p/>
+        </w:tc>
+        <w:tc>
+          <w:tcPr>
+            <w:tcW w:type="dxa" w:w="5669"/>
+            <w:shd w:val="clear" w:color="auto" w:fill="F4F6FA"/>
+            <w:tcBorders>
+              <w:top w:val="single" w:sz="10" w:color="003F87"/>
+              <w:left w:val="single" w:sz="10" w:color="003F87"/>
+              <w:bottom w:val="single" w:sz="10" w:color="003F87"/>
+              <w:right w:val="single" w:sz="10" w:color="003F87"/>
+            </w:tcBorders>
+            <w:vAlign w:val="center"/>
+          </w:tcPr>
+          <w:p>
+            <w:pPr>
+              <w:jc w:val="left"/>
+            </w:pPr>
+            <w:r>
+              <w:rPr>
+                <w:rFonts w:ascii="Calibri" w:hAnsi="Calibri"/>
+                <w:b/>
+                <w:i w:val="0"/>
+                <w:color w:val="003F87"/>
+                <w:sz w:val="18"/>
+              </w:rPr>
+              <w:t xml:space="preserve"> CHAIR </w:t>
+            </w:r>
+          </w:p>
+          <w:p>
+            <w:pPr>
+              <w:jc w:val="center"/>
+            </w:pPr>
+            <w:r>
+              <w:rPr>
+                <w:rFonts w:ascii="Calibri" w:hAnsi="Calibri"/>
+                <w:b w:val="0"/>
+                <w:i/>
+                <w:color w:val="2B2B2B"/>
+                <w:sz w:val="20"/>
+              </w:rPr>
+              <w:t>[ Insert Photo ]</w:t>
+            </w:r>
+          </w:p>
+          <w:p>
+            <w:pPr>
+              <w:jc w:val="center"/>
+            </w:pPr>
+            <w:r>
+              <w:rPr>
+                <w:rFonts w:ascii="Calibri" w:hAnsi="Calibri"/>
+                <w:b/>
+                <w:i w:val="0"/>
+                <w:color w:val="003F87"/>
+                <w:sz w:val="22"/>
+              </w:rPr>
+              <w:t>IT Chairperson</w:t>
+            </w:r>
+          </w:p>
+          <w:p>
+            <w:pPr>
+              <w:jc w:val="center"/>
+            </w:pPr>
+            <w:r>
+              <w:rPr>
+                <w:rFonts w:ascii="Calibri" w:hAnsi="Calibri"/>
+                <w:b w:val="0"/>
+                <w:i/>
+                <w:color w:val="2B2B2B"/>
+                <w:sz w:val="18"/>
+              </w:rPr>
+              <w:t>District 3232F1 · A-19</w:t>
+            </w:r>
+          </w:p>
+        </w:tc>
+        <w:tc>
+          <w:tcPr>
+            <w:tcW w:type="dxa" w:w="4252"/>
+          </w:tcPr>
+          <w:p/>
+        </w:tc>
+      </w:tr>
+    </w:tbl>
+    <w:p>
       <w:pPr>
         <w:pStyle w:val="ListBullet"/>
       </w:pPr>
@@ -320,331 +756,6 @@
         <w:t>Reporting: monthly MMR · dashboards · Annual Activity Report</w:t>
       </w:r>
     </w:p>
-    <w:p>
-      <w:r>
-        <w:rPr>
-          <w:rFonts w:ascii="Calibri" w:hAnsi="Calibri"/>
-          <w:b/>
-          <w:i w:val="0"/>
-          <w:color w:val="003F87"/>
-          <w:sz w:val="26"/>
-        </w:rPr>
-        <w:t>Leadership · 2025–26</w:t>
-      </w:r>
-    </w:p>
-    <w:tbl>
-      <w:tblPr>
-        <w:tblW w:type="auto" w:w="0"/>
-        <w:tblLayout w:type="fixed"/>
-        <w:tblLook w:firstColumn="1" w:firstRow="1" w:lastColumn="0" w:lastRow="0" w:noHBand="0" w:noVBand="1" w:val="04A0"/>
-      </w:tblPr>
-      <w:tblGrid>
-        <w:gridCol w:w="7070"/>
-        <w:gridCol w:w="7070"/>
-      </w:tblGrid>
-      <w:tr>
-        <w:trPr>
-          <w:trHeight w:val="2835"/>
-        </w:trPr>
-        <w:tc>
-          <w:tcPr>
-            <w:tcW w:type="dxa" w:w="6520"/>
-            <w:shd w:val="clear" w:color="auto" w:fill="F4F6FA"/>
-            <w:tcBorders>
-              <w:top w:val="single" w:sz="10" w:color="003F87"/>
-              <w:left w:val="single" w:sz="10" w:color="003F87"/>
-              <w:bottom w:val="single" w:sz="10" w:color="003F87"/>
-              <w:right w:val="single" w:sz="10" w:color="003F87"/>
-            </w:tcBorders>
-            <w:vAlign w:val="center"/>
-          </w:tcPr>
-          <w:p>
-            <w:pPr>
-              <w:jc w:val="left"/>
-            </w:pPr>
-            <w:r>
-              <w:rPr>
-                <w:rFonts w:ascii="Calibri" w:hAnsi="Calibri"/>
-                <w:b/>
-                <w:i w:val="0"/>
-                <w:color w:val="003F87"/>
-                <w:sz w:val="18"/>
-              </w:rPr>
-              <w:t xml:space="preserve"> GOV 1 </w:t>
-            </w:r>
-          </w:p>
-          <w:p>
-            <w:pPr>
-              <w:jc w:val="center"/>
-            </w:pPr>
-            <w:r>
-              <w:rPr>
-                <w:rFonts w:ascii="Calibri" w:hAnsi="Calibri"/>
-                <w:b w:val="0"/>
-                <w:i/>
-                <w:color w:val="2B2B2B"/>
-                <w:sz w:val="20"/>
-              </w:rPr>
-              <w:t>[ Insert Photo ]</w:t>
-            </w:r>
-          </w:p>
-          <w:p>
-            <w:pPr>
-              <w:jc w:val="center"/>
-            </w:pPr>
-            <w:r>
-              <w:rPr>
-                <w:rFonts w:ascii="Calibri" w:hAnsi="Calibri"/>
-                <w:b/>
-                <w:i w:val="0"/>
-                <w:color w:val="003F87"/>
-                <w:sz w:val="22"/>
-              </w:rPr>
-              <w:t>Int'l President</w:t>
-            </w:r>
-          </w:p>
-          <w:p>
-            <w:pPr>
-              <w:jc w:val="center"/>
-            </w:pPr>
-            <w:r>
-              <w:rPr>
-                <w:rFonts w:ascii="Calibri" w:hAnsi="Calibri"/>
-                <w:b w:val="0"/>
-                <w:i/>
-                <w:color w:val="2B2B2B"/>
-                <w:sz w:val="18"/>
-              </w:rPr>
-              <w:t>Lions International</w:t>
-            </w:r>
-          </w:p>
-        </w:tc>
-        <w:tc>
-          <w:tcPr>
-            <w:tcW w:type="dxa" w:w="6520"/>
-            <w:shd w:val="clear" w:color="auto" w:fill="F4F6FA"/>
-            <w:tcBorders>
-              <w:top w:val="single" w:sz="10" w:color="003F87"/>
-              <w:left w:val="single" w:sz="10" w:color="003F87"/>
-              <w:bottom w:val="single" w:sz="10" w:color="003F87"/>
-              <w:right w:val="single" w:sz="10" w:color="003F87"/>
-            </w:tcBorders>
-            <w:vAlign w:val="center"/>
-          </w:tcPr>
-          <w:p>
-            <w:pPr>
-              <w:jc w:val="left"/>
-            </w:pPr>
-            <w:r>
-              <w:rPr>
-                <w:rFonts w:ascii="Calibri" w:hAnsi="Calibri"/>
-                <w:b/>
-                <w:i w:val="0"/>
-                <w:color w:val="003F87"/>
-                <w:sz w:val="18"/>
-              </w:rPr>
-              <w:t xml:space="preserve"> GOV 2 </w:t>
-            </w:r>
-          </w:p>
-          <w:p>
-            <w:pPr>
-              <w:jc w:val="center"/>
-            </w:pPr>
-            <w:r>
-              <w:rPr>
-                <w:rFonts w:ascii="Calibri" w:hAnsi="Calibri"/>
-                <w:b w:val="0"/>
-                <w:i/>
-                <w:color w:val="2B2B2B"/>
-                <w:sz w:val="20"/>
-              </w:rPr>
-              <w:t>[ Insert Photo ]</w:t>
-            </w:r>
-          </w:p>
-          <w:p>
-            <w:pPr>
-              <w:jc w:val="center"/>
-            </w:pPr>
-            <w:r>
-              <w:rPr>
-                <w:rFonts w:ascii="Calibri" w:hAnsi="Calibri"/>
-                <w:b/>
-                <w:i w:val="0"/>
-                <w:color w:val="003F87"/>
-                <w:sz w:val="22"/>
-              </w:rPr>
-              <w:t>Council Chair</w:t>
-            </w:r>
-          </w:p>
-          <w:p>
-            <w:pPr>
-              <w:jc w:val="center"/>
-            </w:pPr>
-            <w:r>
-              <w:rPr>
-                <w:rFonts w:ascii="Calibri" w:hAnsi="Calibri"/>
-                <w:b w:val="0"/>
-                <w:i/>
-                <w:color w:val="2B2B2B"/>
-                <w:sz w:val="18"/>
-              </w:rPr>
-              <w:t>Multiple District 3232</w:t>
-            </w:r>
-          </w:p>
-        </w:tc>
-      </w:tr>
-      <w:tr>
-        <w:trPr>
-          <w:trHeight w:val="2835"/>
-        </w:trPr>
-        <w:tc>
-          <w:tcPr>
-            <w:tcW w:type="dxa" w:w="6520"/>
-            <w:shd w:val="clear" w:color="auto" w:fill="F4F6FA"/>
-            <w:tcBorders>
-              <w:top w:val="single" w:sz="10" w:color="003F87"/>
-              <w:left w:val="single" w:sz="10" w:color="003F87"/>
-              <w:bottom w:val="single" w:sz="10" w:color="003F87"/>
-              <w:right w:val="single" w:sz="10" w:color="003F87"/>
-            </w:tcBorders>
-            <w:vAlign w:val="center"/>
-          </w:tcPr>
-          <w:p>
-            <w:pPr>
-              <w:jc w:val="left"/>
-            </w:pPr>
-            <w:r>
-              <w:rPr>
-                <w:rFonts w:ascii="Calibri" w:hAnsi="Calibri"/>
-                <w:b/>
-                <w:i w:val="0"/>
-                <w:color w:val="003F87"/>
-                <w:sz w:val="18"/>
-              </w:rPr>
-              <w:t xml:space="preserve"> GOV 3 </w:t>
-            </w:r>
-          </w:p>
-          <w:p>
-            <w:pPr>
-              <w:jc w:val="center"/>
-            </w:pPr>
-            <w:r>
-              <w:rPr>
-                <w:rFonts w:ascii="Calibri" w:hAnsi="Calibri"/>
-                <w:b w:val="0"/>
-                <w:i/>
-                <w:color w:val="2B2B2B"/>
-                <w:sz w:val="20"/>
-              </w:rPr>
-              <w:t>[ Insert Photo ]</w:t>
-            </w:r>
-          </w:p>
-          <w:p>
-            <w:pPr>
-              <w:jc w:val="center"/>
-            </w:pPr>
-            <w:r>
-              <w:rPr>
-                <w:rFonts w:ascii="Calibri" w:hAnsi="Calibri"/>
-                <w:b/>
-                <w:i w:val="0"/>
-                <w:color w:val="003F87"/>
-                <w:sz w:val="22"/>
-              </w:rPr>
-              <w:t>District Governor</w:t>
-            </w:r>
-          </w:p>
-          <w:p>
-            <w:pPr>
-              <w:jc w:val="center"/>
-            </w:pPr>
-            <w:r>
-              <w:rPr>
-                <w:rFonts w:ascii="Calibri" w:hAnsi="Calibri"/>
-                <w:b w:val="0"/>
-                <w:i/>
-                <w:color w:val="2B2B2B"/>
-                <w:sz w:val="18"/>
-              </w:rPr>
-              <w:t>District 3232F1</w:t>
-            </w:r>
-          </w:p>
-        </w:tc>
-        <w:tc>
-          <w:tcPr>
-            <w:tcW w:type="dxa" w:w="6520"/>
-            <w:shd w:val="clear" w:color="auto" w:fill="F4F6FA"/>
-            <w:tcBorders>
-              <w:top w:val="single" w:sz="10" w:color="003F87"/>
-              <w:left w:val="single" w:sz="10" w:color="003F87"/>
-              <w:bottom w:val="single" w:sz="10" w:color="003F87"/>
-              <w:right w:val="single" w:sz="10" w:color="003F87"/>
-            </w:tcBorders>
-            <w:vAlign w:val="center"/>
-          </w:tcPr>
-          <w:p>
-            <w:pPr>
-              <w:jc w:val="left"/>
-            </w:pPr>
-            <w:r>
-              <w:rPr>
-                <w:rFonts w:ascii="Calibri" w:hAnsi="Calibri"/>
-                <w:b/>
-                <w:i w:val="0"/>
-                <w:color w:val="003F87"/>
-                <w:sz w:val="18"/>
-              </w:rPr>
-              <w:t xml:space="preserve"> GOV 4 </w:t>
-            </w:r>
-          </w:p>
-          <w:p>
-            <w:pPr>
-              <w:jc w:val="center"/>
-            </w:pPr>
-            <w:r>
-              <w:rPr>
-                <w:rFonts w:ascii="Calibri" w:hAnsi="Calibri"/>
-                <w:b w:val="0"/>
-                <w:i/>
-                <w:color w:val="2B2B2B"/>
-                <w:sz w:val="20"/>
-              </w:rPr>
-              <w:t>[ Insert Photo ]</w:t>
-            </w:r>
-          </w:p>
-          <w:p>
-            <w:pPr>
-              <w:jc w:val="center"/>
-            </w:pPr>
-            <w:r>
-              <w:rPr>
-                <w:rFonts w:ascii="Calibri" w:hAnsi="Calibri"/>
-                <w:b/>
-                <w:i w:val="0"/>
-                <w:color w:val="003F87"/>
-                <w:sz w:val="22"/>
-              </w:rPr>
-              <w:t>IPDG / VDG</w:t>
-            </w:r>
-          </w:p>
-          <w:p>
-            <w:pPr>
-              <w:jc w:val="center"/>
-            </w:pPr>
-            <w:r>
-              <w:rPr>
-                <w:rFonts w:ascii="Calibri" w:hAnsi="Calibri"/>
-                <w:b w:val="0"/>
-                <w:i/>
-                <w:color w:val="2B2B2B"/>
-                <w:sz w:val="18"/>
-              </w:rPr>
-              <w:t>District 3232F1</w:t>
-            </w:r>
-          </w:p>
-        </w:tc>
-      </w:tr>
-    </w:tbl>
     <w:p>
       <w:pPr>
         <w:jc w:val="center"/>

</xml_diff>

<commit_message>
docs: regenerate Word deck from rendered PDF pages
Replaces the older table-based docx with one that embeds high-res
PNG renders of every PDF page. Word output now matches the PDF
exactly: 4 emblems, themed backgrounds, glass panels, image strips.
</commit_message>
<xml_diff>
--- a/docs/A19_IT_CHAIRPERSON_DECK.docx
+++ b/docs/A19_IT_CHAIRPERSON_DECK.docx
@@ -2,3880 +2,269 @@
 <file path=word/document.xml><?xml version="1.0" encoding="utf-8"?>
 <w:document xmlns:wpc="http://schemas.microsoft.com/office/word/2010/wordprocessingCanvas" xmlns:mo="http://schemas.microsoft.com/office/mac/office/2008/main" xmlns:mc="http://schemas.openxmlformats.org/markup-compatibility/2006" xmlns:mv="urn:schemas-microsoft-com:mac:vml" xmlns:o="urn:schemas-microsoft-com:office:office" xmlns:r="http://schemas.openxmlformats.org/officeDocument/2006/relationships" xmlns:m="http://schemas.openxmlformats.org/officeDocument/2006/math" xmlns:v="urn:schemas-microsoft-com:vml" xmlns:wp14="http://schemas.microsoft.com/office/word/2010/wordprocessingDrawing" xmlns:wp="http://schemas.openxmlformats.org/drawingml/2006/wordprocessingDrawing" xmlns:w10="urn:schemas-microsoft-com:office:word" xmlns:w="http://schemas.openxmlformats.org/wordprocessingml/2006/main" xmlns:w14="http://schemas.microsoft.com/office/word/2010/wordml" xmlns:wpg="http://schemas.microsoft.com/office/word/2010/wordprocessingGroup" xmlns:wpi="http://schemas.microsoft.com/office/word/2010/wordprocessingInk" xmlns:wne="http://schemas.microsoft.com/office/word/2006/wordml" xmlns:wps="http://schemas.microsoft.com/office/word/2010/wordprocessingShape" mc:Ignorable="w14 wp14">
   <w:body>
-    <w:tbl>
-      <w:tblPr>
-        <w:tblW w:type="auto" w:w="0"/>
-        <w:tblLayout w:type="fixed"/>
-        <w:tblLook w:firstColumn="1" w:firstRow="1" w:lastColumn="0" w:lastRow="0" w:noHBand="0" w:noVBand="1" w:val="04A0"/>
-      </w:tblPr>
-      <w:tblGrid>
-        <w:gridCol w:w="3535"/>
-        <w:gridCol w:w="3535"/>
-        <w:gridCol w:w="3535"/>
-        <w:gridCol w:w="3535"/>
-      </w:tblGrid>
-      <w:tr>
-        <w:tc>
-          <w:tcPr>
-            <w:tcW w:type="dxa" w:w="3543"/>
-            <w:shd w:val="clear" w:color="auto" w:fill="003F87"/>
-            <w:tcBorders>
-              <w:top w:val="single" w:sz="12" w:color="FFC72C"/>
-              <w:left w:val="single" w:sz="12" w:color="FFC72C"/>
-              <w:bottom w:val="single" w:sz="12" w:color="FFC72C"/>
-              <w:right w:val="single" w:sz="12" w:color="FFC72C"/>
-            </w:tcBorders>
-            <w:vAlign w:val="center"/>
-          </w:tcPr>
-          <w:p>
-            <w:pPr>
-              <w:jc w:val="center"/>
-            </w:pPr>
-            <w:r>
-              <w:rPr>
-                <w:rFonts w:ascii="Calibri" w:hAnsi="Calibri"/>
-                <w:b/>
-                <w:i w:val="0"/>
-                <w:color w:val="FFFFFF"/>
-                <w:sz w:val="28"/>
-              </w:rPr>
-              <w:t>LCI</w:t>
-            </w:r>
-          </w:p>
-        </w:tc>
-        <w:tc>
-          <w:tcPr>
-            <w:tcW w:type="dxa" w:w="3543"/>
-            <w:shd w:val="clear" w:color="auto" w:fill="003F87"/>
-            <w:tcBorders>
-              <w:top w:val="single" w:sz="12" w:color="FFC72C"/>
-              <w:left w:val="single" w:sz="12" w:color="FFC72C"/>
-              <w:bottom w:val="single" w:sz="12" w:color="FFC72C"/>
-              <w:right w:val="single" w:sz="12" w:color="FFC72C"/>
-            </w:tcBorders>
-            <w:vAlign w:val="center"/>
-          </w:tcPr>
-          <w:p>
-            <w:pPr>
-              <w:jc w:val="center"/>
-            </w:pPr>
-            <w:r>
-              <w:rPr>
-                <w:rFonts w:ascii="Calibri" w:hAnsi="Calibri"/>
-                <w:b/>
-                <w:i w:val="0"/>
-                <w:color w:val="FFFFFF"/>
-                <w:sz w:val="28"/>
-              </w:rPr>
-              <w:t>MD 3232</w:t>
-            </w:r>
-          </w:p>
-        </w:tc>
-        <w:tc>
-          <w:tcPr>
-            <w:tcW w:type="dxa" w:w="3543"/>
-            <w:shd w:val="clear" w:color="auto" w:fill="003F87"/>
-            <w:tcBorders>
-              <w:top w:val="single" w:sz="12" w:color="FFC72C"/>
-              <w:left w:val="single" w:sz="12" w:color="FFC72C"/>
-              <w:bottom w:val="single" w:sz="12" w:color="FFC72C"/>
-              <w:right w:val="single" w:sz="12" w:color="FFC72C"/>
-            </w:tcBorders>
-            <w:vAlign w:val="center"/>
-          </w:tcPr>
-          <w:p>
-            <w:pPr>
-              <w:jc w:val="center"/>
-            </w:pPr>
-            <w:r>
-              <w:rPr>
-                <w:rFonts w:ascii="Calibri" w:hAnsi="Calibri"/>
-                <w:b/>
-                <w:i w:val="0"/>
-                <w:color w:val="FFFFFF"/>
-                <w:sz w:val="28"/>
-              </w:rPr>
-              <w:t>DIST 3232F1</w:t>
-            </w:r>
-          </w:p>
-        </w:tc>
-        <w:tc>
-          <w:tcPr>
-            <w:tcW w:type="dxa" w:w="3543"/>
-            <w:shd w:val="clear" w:color="auto" w:fill="003F87"/>
-            <w:tcBorders>
-              <w:top w:val="single" w:sz="12" w:color="FFC72C"/>
-              <w:left w:val="single" w:sz="12" w:color="FFC72C"/>
-              <w:bottom w:val="single" w:sz="12" w:color="FFC72C"/>
-              <w:right w:val="single" w:sz="12" w:color="FFC72C"/>
-            </w:tcBorders>
-            <w:vAlign w:val="center"/>
-          </w:tcPr>
-          <w:p>
-            <w:pPr>
-              <w:jc w:val="center"/>
-            </w:pPr>
-            <w:r>
-              <w:rPr>
-                <w:rFonts w:ascii="Calibri" w:hAnsi="Calibri"/>
-                <w:b/>
-                <w:i w:val="0"/>
-                <w:color w:val="FFFFFF"/>
-                <w:sz w:val="28"/>
-              </w:rPr>
-              <w:t>A-19</w:t>
-            </w:r>
-          </w:p>
-        </w:tc>
-      </w:tr>
-    </w:tbl>
     <w:p>
       <w:pPr>
+        <w:spacing w:before="0" w:after="0"/>
         <w:jc w:val="center"/>
       </w:pPr>
       <w:r>
-        <w:rPr>
-          <w:rFonts w:ascii="Calibri" w:hAnsi="Calibri"/>
-          <w:b/>
-          <w:i w:val="0"/>
-          <w:color w:val="003F87"/>
-          <w:sz w:val="24"/>
-        </w:rPr>
-        <w:t>LIONS INTERNATIONAL · DISTRICT 3232F1</w:t>
+        <w:drawing>
+          <wp:inline xmlns:a="http://schemas.openxmlformats.org/drawingml/2006/main" xmlns:pic="http://schemas.openxmlformats.org/drawingml/2006/picture">
+            <wp:extent cx="7200900" cy="10178776"/>
+            <wp:docPr id="1" name="Picture 1"/>
+            <wp:cNvGraphicFramePr>
+              <a:graphicFrameLocks noChangeAspect="1"/>
+            </wp:cNvGraphicFramePr>
+            <a:graphic>
+              <a:graphicData uri="http://schemas.openxmlformats.org/drawingml/2006/picture">
+                <pic:pic>
+                  <pic:nvPicPr>
+                    <pic:cNvPr id="0" name="page_01.png"/>
+                    <pic:cNvPicPr/>
+                  </pic:nvPicPr>
+                  <pic:blipFill>
+                    <a:blip r:embed="rId9"/>
+                    <a:stretch>
+                      <a:fillRect/>
+                    </a:stretch>
+                  </pic:blipFill>
+                  <pic:spPr>
+                    <a:xfrm>
+                      <a:off x="0" y="0"/>
+                      <a:ext cx="7200900" cy="10178776"/>
+                    </a:xfrm>
+                    <a:prstGeom prst="rect"/>
+                  </pic:spPr>
+                </pic:pic>
+              </a:graphicData>
+            </a:graphic>
+          </wp:inline>
+        </w:drawing>
+      </w:r>
+      <w:r>
+        <w:br w:type="page"/>
       </w:r>
     </w:p>
     <w:p>
       <w:pPr>
+        <w:spacing w:before="0" w:after="0"/>
         <w:jc w:val="center"/>
       </w:pPr>
       <w:r>
-        <w:rPr>
-          <w:rFonts w:ascii="Calibri" w:hAnsi="Calibri"/>
-          <w:b w:val="0"/>
-          <w:i/>
-          <w:color w:val="2B2B2B"/>
-          <w:sz w:val="20"/>
-        </w:rPr>
-        <w:t>A-19 District Information Technology Chairperson</w:t>
+        <w:drawing>
+          <wp:inline xmlns:a="http://schemas.openxmlformats.org/drawingml/2006/main" xmlns:pic="http://schemas.openxmlformats.org/drawingml/2006/picture">
+            <wp:extent cx="7200900" cy="10178776"/>
+            <wp:docPr id="2" name="Picture 2"/>
+            <wp:cNvGraphicFramePr>
+              <a:graphicFrameLocks noChangeAspect="1"/>
+            </wp:cNvGraphicFramePr>
+            <a:graphic>
+              <a:graphicData uri="http://schemas.openxmlformats.org/drawingml/2006/picture">
+                <pic:pic>
+                  <pic:nvPicPr>
+                    <pic:cNvPr id="0" name="page_02.png"/>
+                    <pic:cNvPicPr/>
+                  </pic:nvPicPr>
+                  <pic:blipFill>
+                    <a:blip r:embed="rId10"/>
+                    <a:stretch>
+                      <a:fillRect/>
+                    </a:stretch>
+                  </pic:blipFill>
+                  <pic:spPr>
+                    <a:xfrm>
+                      <a:off x="0" y="0"/>
+                      <a:ext cx="7200900" cy="10178776"/>
+                    </a:xfrm>
+                    <a:prstGeom prst="rect"/>
+                  </pic:spPr>
+                </pic:pic>
+              </a:graphicData>
+            </a:graphic>
+          </wp:inline>
+        </w:drawing>
       </w:r>
-    </w:p>
-    <w:p>
       <w:r>
-        <w:rPr>
-          <w:rFonts w:ascii="Calibri" w:hAnsi="Calibri"/>
-          <w:b/>
-          <w:i w:val="0"/>
-          <w:color w:val="003F87"/>
-          <w:sz w:val="20"/>
-        </w:rPr>
-        <w:t xml:space="preserve">  PAGE 1 · TOPIC 1  </w:t>
-      </w:r>
-    </w:p>
-    <w:p>
-      <w:r>
-        <w:rPr>
-          <w:rFonts w:ascii="Calibri" w:hAnsi="Calibri"/>
-          <w:b/>
-          <w:i w:val="0"/>
-          <w:color w:val="003F87"/>
-          <w:sz w:val="44"/>
-        </w:rPr>
-        <w:t>Roles &amp; Responsibilities</w:t>
-      </w:r>
-    </w:p>
-    <w:p>
-      <w:r>
-        <w:rPr>
-          <w:rFonts w:ascii="Calibri" w:hAnsi="Calibri"/>
-          <w:b w:val="0"/>
-          <w:i/>
-          <w:color w:val="2B2B2B"/>
-          <w:sz w:val="24"/>
-        </w:rPr>
-        <w:t>District Information Technology Chairperson · 3232F1</w:t>
-      </w:r>
-    </w:p>
-    <w:tbl>
-      <w:tblPr>
-        <w:tblW w:type="auto" w:w="0"/>
-        <w:tblLook w:firstColumn="1" w:firstRow="1" w:lastColumn="0" w:lastRow="0" w:noHBand="0" w:noVBand="1" w:val="04A0"/>
-      </w:tblPr>
-      <w:tblGrid>
-        <w:gridCol w:w="14140"/>
-      </w:tblGrid>
-      <w:tr>
-        <w:tc>
-          <w:tcPr>
-            <w:tcW w:type="dxa" w:w="14140"/>
-            <w:shd w:val="clear" w:color="auto" w:fill="F4F6FA"/>
-            <w:tcBorders>
-              <w:top w:val="single" w:sz="18" w:color="FFC72C"/>
-              <w:left w:val="single" w:sz="18" w:color="FFC72C"/>
-              <w:bottom w:val="single" w:sz="18" w:color="FFC72C"/>
-              <w:right w:val="single" w:sz="18" w:color="FFC72C"/>
-            </w:tcBorders>
-          </w:tcPr>
-          <w:p>
-            <w:r>
-              <w:rPr>
-                <w:rFonts w:ascii="Calibri" w:hAnsi="Calibri"/>
-                <w:b w:val="0"/>
-                <w:i w:val="0"/>
-                <w:color w:val="2B2B2B"/>
-                <w:sz w:val="22"/>
-              </w:rPr>
-              <w:t>Lions International IT Chairperson — Job Duties, Responsibilities &amp; Benefits. Branding Lionism for impact at District and Club levels.</w:t>
-            </w:r>
-          </w:p>
-        </w:tc>
-      </w:tr>
-    </w:tbl>
-    <w:p>
-      <w:r>
-        <w:rPr>
-          <w:rFonts w:ascii="Calibri" w:hAnsi="Calibri"/>
-          <w:b/>
-          <w:i w:val="0"/>
-          <w:color w:val="003F87"/>
-          <w:sz w:val="26"/>
-        </w:rPr>
-        <w:t>Leadership · 2025–26</w:t>
-      </w:r>
-    </w:p>
-    <w:tbl>
-      <w:tblPr>
-        <w:tblW w:type="auto" w:w="0"/>
-        <w:tblLayout w:type="fixed"/>
-        <w:tblLook w:firstColumn="1" w:firstRow="1" w:lastColumn="0" w:lastRow="0" w:noHBand="0" w:noVBand="1" w:val="04A0"/>
-      </w:tblPr>
-      <w:tblGrid>
-        <w:gridCol w:w="3535"/>
-        <w:gridCol w:w="3535"/>
-        <w:gridCol w:w="3535"/>
-        <w:gridCol w:w="3535"/>
-      </w:tblGrid>
-      <w:tr>
-        <w:trPr>
-          <w:trHeight w:val="2551"/>
-        </w:trPr>
-        <w:tc>
-          <w:tcPr>
-            <w:tcW w:type="dxa" w:w="3543"/>
-            <w:shd w:val="clear" w:color="auto" w:fill="F4F6FA"/>
-            <w:tcBorders>
-              <w:top w:val="single" w:sz="10" w:color="003F87"/>
-              <w:left w:val="single" w:sz="10" w:color="003F87"/>
-              <w:bottom w:val="single" w:sz="10" w:color="003F87"/>
-              <w:right w:val="single" w:sz="10" w:color="003F87"/>
-            </w:tcBorders>
-            <w:vAlign w:val="center"/>
-          </w:tcPr>
-          <w:p>
-            <w:pPr>
-              <w:jc w:val="left"/>
-            </w:pPr>
-            <w:r>
-              <w:rPr>
-                <w:rFonts w:ascii="Calibri" w:hAnsi="Calibri"/>
-                <w:b/>
-                <w:i w:val="0"/>
-                <w:color w:val="003F87"/>
-                <w:sz w:val="18"/>
-              </w:rPr>
-              <w:t xml:space="preserve"> GOV 1 </w:t>
-            </w:r>
-          </w:p>
-          <w:p>
-            <w:pPr>
-              <w:jc w:val="center"/>
-            </w:pPr>
-            <w:r>
-              <w:rPr>
-                <w:rFonts w:ascii="Calibri" w:hAnsi="Calibri"/>
-                <w:b w:val="0"/>
-                <w:i/>
-                <w:color w:val="2B2B2B"/>
-                <w:sz w:val="20"/>
-              </w:rPr>
-              <w:t>[ Insert Photo ]</w:t>
-            </w:r>
-          </w:p>
-          <w:p>
-            <w:pPr>
-              <w:jc w:val="center"/>
-            </w:pPr>
-            <w:r>
-              <w:rPr>
-                <w:rFonts w:ascii="Calibri" w:hAnsi="Calibri"/>
-                <w:b/>
-                <w:i w:val="0"/>
-                <w:color w:val="003F87"/>
-                <w:sz w:val="22"/>
-              </w:rPr>
-              <w:t>Int'l President</w:t>
-            </w:r>
-          </w:p>
-          <w:p>
-            <w:pPr>
-              <w:jc w:val="center"/>
-            </w:pPr>
-            <w:r>
-              <w:rPr>
-                <w:rFonts w:ascii="Calibri" w:hAnsi="Calibri"/>
-                <w:b w:val="0"/>
-                <w:i/>
-                <w:color w:val="2B2B2B"/>
-                <w:sz w:val="18"/>
-              </w:rPr>
-              <w:t>Lions International</w:t>
-            </w:r>
-          </w:p>
-        </w:tc>
-        <w:tc>
-          <w:tcPr>
-            <w:tcW w:type="dxa" w:w="3543"/>
-            <w:shd w:val="clear" w:color="auto" w:fill="F4F6FA"/>
-            <w:tcBorders>
-              <w:top w:val="single" w:sz="10" w:color="003F87"/>
-              <w:left w:val="single" w:sz="10" w:color="003F87"/>
-              <w:bottom w:val="single" w:sz="10" w:color="003F87"/>
-              <w:right w:val="single" w:sz="10" w:color="003F87"/>
-            </w:tcBorders>
-            <w:vAlign w:val="center"/>
-          </w:tcPr>
-          <w:p>
-            <w:pPr>
-              <w:jc w:val="left"/>
-            </w:pPr>
-            <w:r>
-              <w:rPr>
-                <w:rFonts w:ascii="Calibri" w:hAnsi="Calibri"/>
-                <w:b/>
-                <w:i w:val="0"/>
-                <w:color w:val="003F87"/>
-                <w:sz w:val="18"/>
-              </w:rPr>
-              <w:t xml:space="preserve"> GOV 2 </w:t>
-            </w:r>
-          </w:p>
-          <w:p>
-            <w:pPr>
-              <w:jc w:val="center"/>
-            </w:pPr>
-            <w:r>
-              <w:rPr>
-                <w:rFonts w:ascii="Calibri" w:hAnsi="Calibri"/>
-                <w:b w:val="0"/>
-                <w:i/>
-                <w:color w:val="2B2B2B"/>
-                <w:sz w:val="20"/>
-              </w:rPr>
-              <w:t>[ Insert Photo ]</w:t>
-            </w:r>
-          </w:p>
-          <w:p>
-            <w:pPr>
-              <w:jc w:val="center"/>
-            </w:pPr>
-            <w:r>
-              <w:rPr>
-                <w:rFonts w:ascii="Calibri" w:hAnsi="Calibri"/>
-                <w:b/>
-                <w:i w:val="0"/>
-                <w:color w:val="003F87"/>
-                <w:sz w:val="22"/>
-              </w:rPr>
-              <w:t>Council Chair</w:t>
-            </w:r>
-          </w:p>
-          <w:p>
-            <w:pPr>
-              <w:jc w:val="center"/>
-            </w:pPr>
-            <w:r>
-              <w:rPr>
-                <w:rFonts w:ascii="Calibri" w:hAnsi="Calibri"/>
-                <w:b w:val="0"/>
-                <w:i/>
-                <w:color w:val="2B2B2B"/>
-                <w:sz w:val="18"/>
-              </w:rPr>
-              <w:t>Multiple District 3232</w:t>
-            </w:r>
-          </w:p>
-        </w:tc>
-        <w:tc>
-          <w:tcPr>
-            <w:tcW w:type="dxa" w:w="3543"/>
-            <w:shd w:val="clear" w:color="auto" w:fill="F4F6FA"/>
-            <w:tcBorders>
-              <w:top w:val="single" w:sz="10" w:color="003F87"/>
-              <w:left w:val="single" w:sz="10" w:color="003F87"/>
-              <w:bottom w:val="single" w:sz="10" w:color="003F87"/>
-              <w:right w:val="single" w:sz="10" w:color="003F87"/>
-            </w:tcBorders>
-            <w:vAlign w:val="center"/>
-          </w:tcPr>
-          <w:p>
-            <w:pPr>
-              <w:jc w:val="left"/>
-            </w:pPr>
-            <w:r>
-              <w:rPr>
-                <w:rFonts w:ascii="Calibri" w:hAnsi="Calibri"/>
-                <w:b/>
-                <w:i w:val="0"/>
-                <w:color w:val="003F87"/>
-                <w:sz w:val="18"/>
-              </w:rPr>
-              <w:t xml:space="preserve"> GOV 3 </w:t>
-            </w:r>
-          </w:p>
-          <w:p>
-            <w:pPr>
-              <w:jc w:val="center"/>
-            </w:pPr>
-            <w:r>
-              <w:rPr>
-                <w:rFonts w:ascii="Calibri" w:hAnsi="Calibri"/>
-                <w:b w:val="0"/>
-                <w:i/>
-                <w:color w:val="2B2B2B"/>
-                <w:sz w:val="20"/>
-              </w:rPr>
-              <w:t>[ Insert Photo ]</w:t>
-            </w:r>
-          </w:p>
-          <w:p>
-            <w:pPr>
-              <w:jc w:val="center"/>
-            </w:pPr>
-            <w:r>
-              <w:rPr>
-                <w:rFonts w:ascii="Calibri" w:hAnsi="Calibri"/>
-                <w:b/>
-                <w:i w:val="0"/>
-                <w:color w:val="003F87"/>
-                <w:sz w:val="22"/>
-              </w:rPr>
-              <w:t>District Governor</w:t>
-            </w:r>
-          </w:p>
-          <w:p>
-            <w:pPr>
-              <w:jc w:val="center"/>
-            </w:pPr>
-            <w:r>
-              <w:rPr>
-                <w:rFonts w:ascii="Calibri" w:hAnsi="Calibri"/>
-                <w:b w:val="0"/>
-                <w:i/>
-                <w:color w:val="2B2B2B"/>
-                <w:sz w:val="18"/>
-              </w:rPr>
-              <w:t>District 3232F1</w:t>
-            </w:r>
-          </w:p>
-        </w:tc>
-        <w:tc>
-          <w:tcPr>
-            <w:tcW w:type="dxa" w:w="3543"/>
-            <w:shd w:val="clear" w:color="auto" w:fill="F4F6FA"/>
-            <w:tcBorders>
-              <w:top w:val="single" w:sz="10" w:color="003F87"/>
-              <w:left w:val="single" w:sz="10" w:color="003F87"/>
-              <w:bottom w:val="single" w:sz="10" w:color="003F87"/>
-              <w:right w:val="single" w:sz="10" w:color="003F87"/>
-            </w:tcBorders>
-            <w:vAlign w:val="center"/>
-          </w:tcPr>
-          <w:p>
-            <w:pPr>
-              <w:jc w:val="left"/>
-            </w:pPr>
-            <w:r>
-              <w:rPr>
-                <w:rFonts w:ascii="Calibri" w:hAnsi="Calibri"/>
-                <w:b/>
-                <w:i w:val="0"/>
-                <w:color w:val="003F87"/>
-                <w:sz w:val="18"/>
-              </w:rPr>
-              <w:t xml:space="preserve"> GOV 4 </w:t>
-            </w:r>
-          </w:p>
-          <w:p>
-            <w:pPr>
-              <w:jc w:val="center"/>
-            </w:pPr>
-            <w:r>
-              <w:rPr>
-                <w:rFonts w:ascii="Calibri" w:hAnsi="Calibri"/>
-                <w:b w:val="0"/>
-                <w:i/>
-                <w:color w:val="2B2B2B"/>
-                <w:sz w:val="20"/>
-              </w:rPr>
-              <w:t>[ Insert Photo ]</w:t>
-            </w:r>
-          </w:p>
-          <w:p>
-            <w:pPr>
-              <w:jc w:val="center"/>
-            </w:pPr>
-            <w:r>
-              <w:rPr>
-                <w:rFonts w:ascii="Calibri" w:hAnsi="Calibri"/>
-                <w:b/>
-                <w:i w:val="0"/>
-                <w:color w:val="003F87"/>
-                <w:sz w:val="22"/>
-              </w:rPr>
-              <w:t>IPDG / VDG</w:t>
-            </w:r>
-          </w:p>
-          <w:p>
-            <w:pPr>
-              <w:jc w:val="center"/>
-            </w:pPr>
-            <w:r>
-              <w:rPr>
-                <w:rFonts w:ascii="Calibri" w:hAnsi="Calibri"/>
-                <w:b w:val="0"/>
-                <w:i/>
-                <w:color w:val="2B2B2B"/>
-                <w:sz w:val="18"/>
-              </w:rPr>
-              <w:t>District 3232F1</w:t>
-            </w:r>
-          </w:p>
-        </w:tc>
-      </w:tr>
-    </w:tbl>
-    <w:p>
-      <w:r>
-        <w:rPr>
-          <w:rFonts w:ascii="Calibri" w:hAnsi="Calibri"/>
-          <w:b/>
-          <w:i w:val="0"/>
-          <w:color w:val="003F87"/>
-          <w:sz w:val="26"/>
-        </w:rPr>
-        <w:t>District IT Chairperson · 2025–26</w:t>
-      </w:r>
-    </w:p>
-    <w:tbl>
-      <w:tblPr>
-        <w:tblW w:type="auto" w:w="0"/>
-        <w:tblLayout w:type="fixed"/>
-        <w:tblLook w:firstColumn="1" w:firstRow="1" w:lastColumn="0" w:lastRow="0" w:noHBand="0" w:noVBand="1" w:val="04A0"/>
-      </w:tblPr>
-      <w:tblGrid>
-        <w:gridCol w:w="4713"/>
-        <w:gridCol w:w="4713"/>
-        <w:gridCol w:w="4713"/>
-      </w:tblGrid>
-      <w:tr>
-        <w:trPr>
-          <w:trHeight w:val="2835"/>
-        </w:trPr>
-        <w:tc>
-          <w:tcPr>
-            <w:tcW w:type="dxa" w:w="4252"/>
-          </w:tcPr>
-          <w:p/>
-        </w:tc>
-        <w:tc>
-          <w:tcPr>
-            <w:tcW w:type="dxa" w:w="5669"/>
-            <w:shd w:val="clear" w:color="auto" w:fill="F4F6FA"/>
-            <w:tcBorders>
-              <w:top w:val="single" w:sz="10" w:color="003F87"/>
-              <w:left w:val="single" w:sz="10" w:color="003F87"/>
-              <w:bottom w:val="single" w:sz="10" w:color="003F87"/>
-              <w:right w:val="single" w:sz="10" w:color="003F87"/>
-            </w:tcBorders>
-            <w:vAlign w:val="center"/>
-          </w:tcPr>
-          <w:p>
-            <w:pPr>
-              <w:jc w:val="left"/>
-            </w:pPr>
-            <w:r>
-              <w:rPr>
-                <w:rFonts w:ascii="Calibri" w:hAnsi="Calibri"/>
-                <w:b/>
-                <w:i w:val="0"/>
-                <w:color w:val="003F87"/>
-                <w:sz w:val="18"/>
-              </w:rPr>
-              <w:t xml:space="preserve"> CHAIR </w:t>
-            </w:r>
-          </w:p>
-          <w:p>
-            <w:pPr>
-              <w:jc w:val="center"/>
-            </w:pPr>
-            <w:r>
-              <w:rPr>
-                <w:rFonts w:ascii="Calibri" w:hAnsi="Calibri"/>
-                <w:b w:val="0"/>
-                <w:i/>
-                <w:color w:val="2B2B2B"/>
-                <w:sz w:val="20"/>
-              </w:rPr>
-              <w:t>[ Insert Photo ]</w:t>
-            </w:r>
-          </w:p>
-          <w:p>
-            <w:pPr>
-              <w:jc w:val="center"/>
-            </w:pPr>
-            <w:r>
-              <w:rPr>
-                <w:rFonts w:ascii="Calibri" w:hAnsi="Calibri"/>
-                <w:b/>
-                <w:i w:val="0"/>
-                <w:color w:val="003F87"/>
-                <w:sz w:val="22"/>
-              </w:rPr>
-              <w:t>IT Chairperson</w:t>
-            </w:r>
-          </w:p>
-          <w:p>
-            <w:pPr>
-              <w:jc w:val="center"/>
-            </w:pPr>
-            <w:r>
-              <w:rPr>
-                <w:rFonts w:ascii="Calibri" w:hAnsi="Calibri"/>
-                <w:b w:val="0"/>
-                <w:i/>
-                <w:color w:val="2B2B2B"/>
-                <w:sz w:val="18"/>
-              </w:rPr>
-              <w:t>District 3232F1 · A-19</w:t>
-            </w:r>
-          </w:p>
-        </w:tc>
-        <w:tc>
-          <w:tcPr>
-            <w:tcW w:type="dxa" w:w="4252"/>
-          </w:tcPr>
-          <w:p/>
-        </w:tc>
-      </w:tr>
-    </w:tbl>
-    <w:p>
-      <w:pPr>
-        <w:pStyle w:val="ListBullet"/>
-      </w:pPr>
-      <w:r>
-        <w:rPr>
-          <w:rFonts w:ascii="Calibri" w:hAnsi="Calibri"/>
-          <w:b w:val="0"/>
-          <w:i w:val="0"/>
-          <w:color w:val="2B2B2B"/>
-          <w:sz w:val="22"/>
-        </w:rPr>
-        <w:t>Digital leader for the District Cabinet &amp; 100+ clubs</w:t>
+        <w:br w:type="page"/>
       </w:r>
     </w:p>
     <w:p>
       <w:pPr>
-        <w:pStyle w:val="ListBullet"/>
+        <w:spacing w:before="0" w:after="0"/>
+        <w:jc w:val="center"/>
       </w:pPr>
       <w:r>
-        <w:rPr>
-          <w:rFonts w:ascii="Calibri" w:hAnsi="Calibri"/>
-          <w:b w:val="0"/>
-          <w:i w:val="0"/>
-          <w:color w:val="2B2B2B"/>
-          <w:sz w:val="22"/>
-        </w:rPr>
-        <w:t>Governance: digital policy, data privacy, brand standards</w:t>
+        <w:drawing>
+          <wp:inline xmlns:a="http://schemas.openxmlformats.org/drawingml/2006/main" xmlns:pic="http://schemas.openxmlformats.org/drawingml/2006/picture">
+            <wp:extent cx="7200900" cy="10178776"/>
+            <wp:docPr id="3" name="Picture 3"/>
+            <wp:cNvGraphicFramePr>
+              <a:graphicFrameLocks noChangeAspect="1"/>
+            </wp:cNvGraphicFramePr>
+            <a:graphic>
+              <a:graphicData uri="http://schemas.openxmlformats.org/drawingml/2006/picture">
+                <pic:pic>
+                  <pic:nvPicPr>
+                    <pic:cNvPr id="0" name="page_03.png"/>
+                    <pic:cNvPicPr/>
+                  </pic:nvPicPr>
+                  <pic:blipFill>
+                    <a:blip r:embed="rId11"/>
+                    <a:stretch>
+                      <a:fillRect/>
+                    </a:stretch>
+                  </pic:blipFill>
+                  <pic:spPr>
+                    <a:xfrm>
+                      <a:off x="0" y="0"/>
+                      <a:ext cx="7200900" cy="10178776"/>
+                    </a:xfrm>
+                    <a:prstGeom prst="rect"/>
+                  </pic:spPr>
+                </pic:pic>
+              </a:graphicData>
+            </a:graphic>
+          </wp:inline>
+        </w:drawing>
+      </w:r>
+      <w:r>
+        <w:br w:type="page"/>
       </w:r>
     </w:p>
     <w:p>
       <w:pPr>
-        <w:pStyle w:val="ListBullet"/>
+        <w:spacing w:before="0" w:after="0"/>
+        <w:jc w:val="center"/>
       </w:pPr>
       <w:r>
-        <w:rPr>
-          <w:rFonts w:ascii="Calibri" w:hAnsi="Calibri"/>
-          <w:b w:val="0"/>
-          <w:i w:val="0"/>
-          <w:color w:val="2B2B2B"/>
-          <w:sz w:val="22"/>
-        </w:rPr>
-        <w:t>Systems: MyLion · MyLCI · Lion Portal · District website</w:t>
+        <w:drawing>
+          <wp:inline xmlns:a="http://schemas.openxmlformats.org/drawingml/2006/main" xmlns:pic="http://schemas.openxmlformats.org/drawingml/2006/picture">
+            <wp:extent cx="7200900" cy="10178776"/>
+            <wp:docPr id="4" name="Picture 4"/>
+            <wp:cNvGraphicFramePr>
+              <a:graphicFrameLocks noChangeAspect="1"/>
+            </wp:cNvGraphicFramePr>
+            <a:graphic>
+              <a:graphicData uri="http://schemas.openxmlformats.org/drawingml/2006/picture">
+                <pic:pic>
+                  <pic:nvPicPr>
+                    <pic:cNvPr id="0" name="page_04.png"/>
+                    <pic:cNvPicPr/>
+                  </pic:nvPicPr>
+                  <pic:blipFill>
+                    <a:blip r:embed="rId12"/>
+                    <a:stretch>
+                      <a:fillRect/>
+                    </a:stretch>
+                  </pic:blipFill>
+                  <pic:spPr>
+                    <a:xfrm>
+                      <a:off x="0" y="0"/>
+                      <a:ext cx="7200900" cy="10178776"/>
+                    </a:xfrm>
+                    <a:prstGeom prst="rect"/>
+                  </pic:spPr>
+                </pic:pic>
+              </a:graphicData>
+            </a:graphic>
+          </wp:inline>
+        </w:drawing>
+      </w:r>
+      <w:r>
+        <w:br w:type="page"/>
       </w:r>
     </w:p>
     <w:p>
       <w:pPr>
-        <w:pStyle w:val="ListBullet"/>
+        <w:spacing w:before="0" w:after="0"/>
+        <w:jc w:val="center"/>
       </w:pPr>
       <w:r>
-        <w:rPr>
-          <w:rFonts w:ascii="Calibri" w:hAnsi="Calibri"/>
-          <w:b w:val="0"/>
-          <w:i w:val="0"/>
-          <w:color w:val="2B2B2B"/>
-          <w:sz w:val="22"/>
-        </w:rPr>
-        <w:t>Club support: onboarding, training, helpdesk for every club</w:t>
+        <w:drawing>
+          <wp:inline xmlns:a="http://schemas.openxmlformats.org/drawingml/2006/main" xmlns:pic="http://schemas.openxmlformats.org/drawingml/2006/picture">
+            <wp:extent cx="7200900" cy="10178776"/>
+            <wp:docPr id="5" name="Picture 5"/>
+            <wp:cNvGraphicFramePr>
+              <a:graphicFrameLocks noChangeAspect="1"/>
+            </wp:cNvGraphicFramePr>
+            <a:graphic>
+              <a:graphicData uri="http://schemas.openxmlformats.org/drawingml/2006/picture">
+                <pic:pic>
+                  <pic:nvPicPr>
+                    <pic:cNvPr id="0" name="page_05.png"/>
+                    <pic:cNvPicPr/>
+                  </pic:nvPicPr>
+                  <pic:blipFill>
+                    <a:blip r:embed="rId13"/>
+                    <a:stretch>
+                      <a:fillRect/>
+                    </a:stretch>
+                  </pic:blipFill>
+                  <pic:spPr>
+                    <a:xfrm>
+                      <a:off x="0" y="0"/>
+                      <a:ext cx="7200900" cy="10178776"/>
+                    </a:xfrm>
+                    <a:prstGeom prst="rect"/>
+                  </pic:spPr>
+                </pic:pic>
+              </a:graphicData>
+            </a:graphic>
+          </wp:inline>
+        </w:drawing>
+      </w:r>
+      <w:r>
+        <w:br w:type="page"/>
       </w:r>
     </w:p>
     <w:p>
       <w:pPr>
-        <w:pStyle w:val="ListBullet"/>
-      </w:pPr>
-      <w:r>
-        <w:rPr>
-          <w:rFonts w:ascii="Calibri" w:hAnsi="Calibri"/>
-          <w:b w:val="0"/>
-          <w:i w:val="0"/>
-          <w:color w:val="2B2B2B"/>
-          <w:sz w:val="22"/>
-        </w:rPr>
-        <w:t>Security: RLS, backups, HMAC webhooks, DPDP Act 2023</w:t>
-      </w:r>
-    </w:p>
-    <w:p>
-      <w:pPr>
-        <w:pStyle w:val="ListBullet"/>
-      </w:pPr>
-      <w:r>
-        <w:rPr>
-          <w:rFonts w:ascii="Calibri" w:hAnsi="Calibri"/>
-          <w:b w:val="0"/>
-          <w:i w:val="0"/>
-          <w:color w:val="2B2B2B"/>
-          <w:sz w:val="22"/>
-        </w:rPr>
-        <w:t>Reporting: monthly MMR · dashboards · Annual Activity Report</w:t>
-      </w:r>
-    </w:p>
-    <w:p>
-      <w:pPr>
+        <w:spacing w:before="0" w:after="0"/>
         <w:jc w:val="center"/>
       </w:pPr>
       <w:r>
-        <w:rPr>
-          <w:rFonts w:ascii="Calibri" w:hAnsi="Calibri"/>
-          <w:b/>
-          <w:i w:val="0"/>
-          <w:color w:val="003F87"/>
-          <w:sz w:val="20"/>
-        </w:rPr>
-        <w:t>We Serve — Powered by Technology   ·   1 / 6</w:t>
-      </w:r>
-    </w:p>
-    <w:p>
-      <w:r>
-        <w:br w:type="page"/>
-      </w:r>
-    </w:p>
-    <w:tbl>
-      <w:tblPr>
-        <w:tblW w:type="auto" w:w="0"/>
-        <w:tblLayout w:type="fixed"/>
-        <w:tblLook w:firstColumn="1" w:firstRow="1" w:lastColumn="0" w:lastRow="0" w:noHBand="0" w:noVBand="1" w:val="04A0"/>
-      </w:tblPr>
-      <w:tblGrid>
-        <w:gridCol w:w="7070"/>
-        <w:gridCol w:w="7070"/>
-      </w:tblGrid>
-      <w:tr>
-        <w:tc>
-          <w:tcPr>
-            <w:tcW w:type="dxa" w:w="7087"/>
-            <w:shd w:val="clear" w:color="auto" w:fill="003F87"/>
-            <w:tcBorders>
-              <w:top w:val="single" w:sz="12" w:color="FFC72C"/>
-              <w:left w:val="single" w:sz="12" w:color="FFC72C"/>
-              <w:bottom w:val="single" w:sz="12" w:color="FFC72C"/>
-              <w:right w:val="single" w:sz="12" w:color="FFC72C"/>
-            </w:tcBorders>
-            <w:vAlign w:val="center"/>
-          </w:tcPr>
-          <w:p>
-            <w:pPr>
-              <w:jc w:val="center"/>
-            </w:pPr>
-            <w:r>
-              <w:rPr>
-                <w:rFonts w:ascii="Calibri" w:hAnsi="Calibri"/>
-                <w:b/>
-                <w:i w:val="0"/>
-                <w:color w:val="FFFFFF"/>
-                <w:sz w:val="28"/>
-              </w:rPr>
-              <w:t>DIST 3232F1</w:t>
-            </w:r>
-          </w:p>
-        </w:tc>
-        <w:tc>
-          <w:tcPr>
-            <w:tcW w:type="dxa" w:w="7087"/>
-            <w:shd w:val="clear" w:color="auto" w:fill="003F87"/>
-            <w:tcBorders>
-              <w:top w:val="single" w:sz="12" w:color="FFC72C"/>
-              <w:left w:val="single" w:sz="12" w:color="FFC72C"/>
-              <w:bottom w:val="single" w:sz="12" w:color="FFC72C"/>
-              <w:right w:val="single" w:sz="12" w:color="FFC72C"/>
-            </w:tcBorders>
-            <w:vAlign w:val="center"/>
-          </w:tcPr>
-          <w:p>
-            <w:pPr>
-              <w:jc w:val="center"/>
-            </w:pPr>
-            <w:r>
-              <w:rPr>
-                <w:rFonts w:ascii="Calibri" w:hAnsi="Calibri"/>
-                <w:b/>
-                <w:i w:val="0"/>
-                <w:color w:val="FFFFFF"/>
-                <w:sz w:val="28"/>
-              </w:rPr>
-              <w:t>LCI</w:t>
-            </w:r>
-          </w:p>
-        </w:tc>
-      </w:tr>
-    </w:tbl>
-    <w:p>
-      <w:pPr>
-        <w:jc w:val="center"/>
-      </w:pPr>
-      <w:r>
-        <w:rPr>
-          <w:rFonts w:ascii="Calibri" w:hAnsi="Calibri"/>
-          <w:b/>
-          <w:i w:val="0"/>
-          <w:color w:val="003F87"/>
-          <w:sz w:val="24"/>
-        </w:rPr>
-        <w:t>LIONS INTERNATIONAL · DISTRICT 3232F1</w:t>
-      </w:r>
-    </w:p>
-    <w:p>
-      <w:pPr>
-        <w:jc w:val="center"/>
-      </w:pPr>
-      <w:r>
-        <w:rPr>
-          <w:rFonts w:ascii="Calibri" w:hAnsi="Calibri"/>
-          <w:b w:val="0"/>
-          <w:i/>
-          <w:color w:val="2B2B2B"/>
-          <w:sz w:val="20"/>
-        </w:rPr>
-        <w:t>A-19 District Information Technology Chairperson</w:t>
-      </w:r>
-    </w:p>
-    <w:p>
-      <w:r>
-        <w:rPr>
-          <w:rFonts w:ascii="Calibri" w:hAnsi="Calibri"/>
-          <w:b/>
-          <w:i w:val="0"/>
-          <w:color w:val="003F87"/>
-          <w:sz w:val="20"/>
-        </w:rPr>
-        <w:t xml:space="preserve">  PAGE 2 · TOPIC 2  </w:t>
-      </w:r>
-    </w:p>
-    <w:p>
-      <w:r>
-        <w:rPr>
-          <w:rFonts w:ascii="Calibri" w:hAnsi="Calibri"/>
-          <w:b/>
-          <w:i w:val="0"/>
-          <w:color w:val="003F87"/>
-          <w:sz w:val="44"/>
-        </w:rPr>
-        <w:t>Knowledge of Lionism, Website, Portal &amp; LLC</w:t>
-      </w:r>
-    </w:p>
-    <w:p>
-      <w:r>
-        <w:rPr>
-          <w:rFonts w:ascii="Calibri" w:hAnsi="Calibri"/>
-          <w:b w:val="0"/>
-          <w:i/>
-          <w:color w:val="2B2B2B"/>
-          <w:sz w:val="24"/>
-        </w:rPr>
-        <w:t>Lion Portal · Website · Lions Learning Center · Digital Ecosystem</w:t>
-      </w:r>
-    </w:p>
-    <w:p>
-      <w:pPr>
-        <w:pStyle w:val="ListBullet"/>
-      </w:pPr>
-      <w:r>
-        <w:rPr>
-          <w:rFonts w:ascii="Calibri" w:hAnsi="Calibri"/>
-          <w:b w:val="0"/>
-          <w:i w:val="0"/>
-          <w:color w:val="2B2B2B"/>
-          <w:sz w:val="22"/>
-        </w:rPr>
-        <w:t>Lionism — 'We Serve' · 5 Global Causes · 1.4M+ Lions</w:t>
-      </w:r>
-    </w:p>
-    <w:p>
-      <w:pPr>
-        <w:pStyle w:val="ListBullet"/>
-      </w:pPr>
-      <w:r>
-        <w:rPr>
-          <w:rFonts w:ascii="Calibri" w:hAnsi="Calibri"/>
-          <w:b w:val="0"/>
-          <w:i w:val="0"/>
-          <w:color w:val="2B2B2B"/>
-          <w:sz w:val="22"/>
-        </w:rPr>
-        <w:t>Lion Portal — SSO, officer reporting, dues, MMR</w:t>
-      </w:r>
-    </w:p>
-    <w:p>
-      <w:pPr>
-        <w:pStyle w:val="ListBullet"/>
-      </w:pPr>
-      <w:r>
-        <w:rPr>
-          <w:rFonts w:ascii="Calibri" w:hAnsi="Calibri"/>
-          <w:b w:val="0"/>
-          <w:i w:val="0"/>
-          <w:color w:val="2B2B2B"/>
-          <w:sz w:val="22"/>
-        </w:rPr>
-        <w:t>Website — Next.js, SEO, WCAG 2.1 AA, mobile-first</w:t>
-      </w:r>
-    </w:p>
-    <w:p>
-      <w:pPr>
-        <w:pStyle w:val="ListBullet"/>
-      </w:pPr>
-      <w:r>
-        <w:rPr>
-          <w:rFonts w:ascii="Calibri" w:hAnsi="Calibri"/>
-          <w:b w:val="0"/>
-          <w:i w:val="0"/>
-          <w:color w:val="2B2B2B"/>
-          <w:sz w:val="22"/>
-        </w:rPr>
-        <w:t>Lions Learning Center — courses for every officer</w:t>
-      </w:r>
-    </w:p>
-    <w:p>
-      <w:pPr>
-        <w:pStyle w:val="ListBullet"/>
-      </w:pPr>
-      <w:r>
-        <w:rPr>
-          <w:rFonts w:ascii="Calibri" w:hAnsi="Calibri"/>
-          <w:b w:val="0"/>
-          <w:i w:val="0"/>
-          <w:color w:val="2B2B2B"/>
-          <w:sz w:val="22"/>
-        </w:rPr>
-        <w:t>MyLion / MyLCI — service activities &amp; membership</w:t>
-      </w:r>
-    </w:p>
-    <w:p>
-      <w:pPr>
-        <w:pStyle w:val="ListBullet"/>
-      </w:pPr>
-      <w:r>
-        <w:rPr>
-          <w:rFonts w:ascii="Calibri" w:hAnsi="Calibri"/>
-          <w:b w:val="0"/>
-          <w:i w:val="0"/>
-          <w:color w:val="2B2B2B"/>
-          <w:sz w:val="22"/>
-        </w:rPr>
-        <w:t>Brand: Lions Blue #003F87 · Gold #FFC72C · We Serve voice</w:t>
-      </w:r>
-    </w:p>
-    <w:tbl>
-      <w:tblPr>
-        <w:tblW w:type="auto" w:w="0"/>
-        <w:tblLayout w:type="fixed"/>
-        <w:tblLook w:firstColumn="1" w:firstRow="1" w:lastColumn="0" w:lastRow="0" w:noHBand="0" w:noVBand="1" w:val="04A0"/>
-      </w:tblPr>
-      <w:tblGrid>
-        <w:gridCol w:w="4713"/>
-        <w:gridCol w:w="4713"/>
-        <w:gridCol w:w="4713"/>
-      </w:tblGrid>
-      <w:tr>
-        <w:trPr>
-          <w:trHeight w:val="2835"/>
-        </w:trPr>
-        <w:tc>
-          <w:tcPr>
-            <w:tcW w:type="dxa" w:w="4724"/>
-            <w:shd w:val="clear" w:color="auto" w:fill="F4F6FA"/>
-            <w:tcBorders>
-              <w:top w:val="single" w:sz="10" w:color="003F87"/>
-              <w:left w:val="single" w:sz="10" w:color="003F87"/>
-              <w:bottom w:val="single" w:sz="10" w:color="003F87"/>
-              <w:right w:val="single" w:sz="10" w:color="003F87"/>
-            </w:tcBorders>
-            <w:vAlign w:val="center"/>
-          </w:tcPr>
-          <w:p>
-            <w:pPr>
-              <w:jc w:val="left"/>
-            </w:pPr>
-            <w:r>
-              <w:rPr>
-                <w:rFonts w:ascii="Calibri" w:hAnsi="Calibri"/>
-                <w:b/>
-                <w:i w:val="0"/>
-                <w:color w:val="003F87"/>
-                <w:sz w:val="18"/>
-              </w:rPr>
-              <w:t xml:space="preserve"> IMG 1 </w:t>
-            </w:r>
-          </w:p>
-          <w:p>
-            <w:pPr>
-              <w:jc w:val="center"/>
-            </w:pPr>
-            <w:r>
-              <w:rPr>
-                <w:rFonts w:ascii="Calibri" w:hAnsi="Calibri"/>
-                <w:b w:val="0"/>
-                <w:i/>
-                <w:color w:val="2B2B2B"/>
-                <w:sz w:val="20"/>
-              </w:rPr>
-              <w:t>[ Insert Photo ]</w:t>
-            </w:r>
-          </w:p>
-          <w:p>
-            <w:pPr>
-              <w:jc w:val="center"/>
-            </w:pPr>
-            <w:r>
-              <w:rPr>
-                <w:rFonts w:ascii="Calibri" w:hAnsi="Calibri"/>
-                <w:b/>
-                <w:i w:val="0"/>
-                <w:color w:val="003F87"/>
-                <w:sz w:val="22"/>
-              </w:rPr>
-              <w:t>Lion Portal</w:t>
-            </w:r>
-          </w:p>
-        </w:tc>
-        <w:tc>
-          <w:tcPr>
-            <w:tcW w:type="dxa" w:w="4724"/>
-            <w:shd w:val="clear" w:color="auto" w:fill="F4F6FA"/>
-            <w:tcBorders>
-              <w:top w:val="single" w:sz="10" w:color="003F87"/>
-              <w:left w:val="single" w:sz="10" w:color="003F87"/>
-              <w:bottom w:val="single" w:sz="10" w:color="003F87"/>
-              <w:right w:val="single" w:sz="10" w:color="003F87"/>
-            </w:tcBorders>
-            <w:vAlign w:val="center"/>
-          </w:tcPr>
-          <w:p>
-            <w:pPr>
-              <w:jc w:val="left"/>
-            </w:pPr>
-            <w:r>
-              <w:rPr>
-                <w:rFonts w:ascii="Calibri" w:hAnsi="Calibri"/>
-                <w:b/>
-                <w:i w:val="0"/>
-                <w:color w:val="003F87"/>
-                <w:sz w:val="18"/>
-              </w:rPr>
-              <w:t xml:space="preserve"> IMG 2 </w:t>
-            </w:r>
-          </w:p>
-          <w:p>
-            <w:pPr>
-              <w:jc w:val="center"/>
-            </w:pPr>
-            <w:r>
-              <w:rPr>
-                <w:rFonts w:ascii="Calibri" w:hAnsi="Calibri"/>
-                <w:b w:val="0"/>
-                <w:i/>
-                <w:color w:val="2B2B2B"/>
-                <w:sz w:val="20"/>
-              </w:rPr>
-              <w:t>[ Insert Photo ]</w:t>
-            </w:r>
-          </w:p>
-          <w:p>
-            <w:pPr>
-              <w:jc w:val="center"/>
-            </w:pPr>
-            <w:r>
-              <w:rPr>
-                <w:rFonts w:ascii="Calibri" w:hAnsi="Calibri"/>
-                <w:b/>
-                <w:i w:val="0"/>
-                <w:color w:val="003F87"/>
-                <w:sz w:val="22"/>
-              </w:rPr>
-              <w:t>Lionism</w:t>
-            </w:r>
-          </w:p>
-        </w:tc>
-        <w:tc>
-          <w:tcPr>
-            <w:tcW w:type="dxa" w:w="4724"/>
-            <w:shd w:val="clear" w:color="auto" w:fill="F4F6FA"/>
-            <w:tcBorders>
-              <w:top w:val="single" w:sz="10" w:color="003F87"/>
-              <w:left w:val="single" w:sz="10" w:color="003F87"/>
-              <w:bottom w:val="single" w:sz="10" w:color="003F87"/>
-              <w:right w:val="single" w:sz="10" w:color="003F87"/>
-            </w:tcBorders>
-            <w:vAlign w:val="center"/>
-          </w:tcPr>
-          <w:p>
-            <w:pPr>
-              <w:jc w:val="left"/>
-            </w:pPr>
-            <w:r>
-              <w:rPr>
-                <w:rFonts w:ascii="Calibri" w:hAnsi="Calibri"/>
-                <w:b/>
-                <w:i w:val="0"/>
-                <w:color w:val="003F87"/>
-                <w:sz w:val="18"/>
-              </w:rPr>
-              <w:t xml:space="preserve"> IMG 3 </w:t>
-            </w:r>
-          </w:p>
-          <w:p>
-            <w:pPr>
-              <w:jc w:val="center"/>
-            </w:pPr>
-            <w:r>
-              <w:rPr>
-                <w:rFonts w:ascii="Calibri" w:hAnsi="Calibri"/>
-                <w:b w:val="0"/>
-                <w:i/>
-                <w:color w:val="2B2B2B"/>
-                <w:sz w:val="20"/>
-              </w:rPr>
-              <w:t>[ Insert Photo ]</w:t>
-            </w:r>
-          </w:p>
-          <w:p>
-            <w:pPr>
-              <w:jc w:val="center"/>
-            </w:pPr>
-            <w:r>
-              <w:rPr>
-                <w:rFonts w:ascii="Calibri" w:hAnsi="Calibri"/>
-                <w:b/>
-                <w:i w:val="0"/>
-                <w:color w:val="003F87"/>
-                <w:sz w:val="22"/>
-              </w:rPr>
-              <w:t>LLC Course</w:t>
-            </w:r>
-          </w:p>
-        </w:tc>
-      </w:tr>
-      <w:tr>
-        <w:trPr>
-          <w:trHeight w:val="2835"/>
-        </w:trPr>
-        <w:tc>
-          <w:tcPr>
-            <w:tcW w:type="dxa" w:w="4724"/>
-            <w:shd w:val="clear" w:color="auto" w:fill="F4F6FA"/>
-            <w:tcBorders>
-              <w:top w:val="single" w:sz="10" w:color="003F87"/>
-              <w:left w:val="single" w:sz="10" w:color="003F87"/>
-              <w:bottom w:val="single" w:sz="10" w:color="003F87"/>
-              <w:right w:val="single" w:sz="10" w:color="003F87"/>
-            </w:tcBorders>
-            <w:vAlign w:val="center"/>
-          </w:tcPr>
-          <w:p>
-            <w:pPr>
-              <w:jc w:val="left"/>
-            </w:pPr>
-            <w:r>
-              <w:rPr>
-                <w:rFonts w:ascii="Calibri" w:hAnsi="Calibri"/>
-                <w:b/>
-                <w:i w:val="0"/>
-                <w:color w:val="003F87"/>
-                <w:sz w:val="18"/>
-              </w:rPr>
-              <w:t xml:space="preserve"> IMG 4 </w:t>
-            </w:r>
-          </w:p>
-          <w:p>
-            <w:pPr>
-              <w:jc w:val="center"/>
-            </w:pPr>
-            <w:r>
-              <w:rPr>
-                <w:rFonts w:ascii="Calibri" w:hAnsi="Calibri"/>
-                <w:b w:val="0"/>
-                <w:i/>
-                <w:color w:val="2B2B2B"/>
-                <w:sz w:val="20"/>
-              </w:rPr>
-              <w:t>[ Insert Photo ]</w:t>
-            </w:r>
-          </w:p>
-          <w:p>
-            <w:pPr>
-              <w:jc w:val="center"/>
-            </w:pPr>
-            <w:r>
-              <w:rPr>
-                <w:rFonts w:ascii="Calibri" w:hAnsi="Calibri"/>
-                <w:b/>
-                <w:i w:val="0"/>
-                <w:color w:val="003F87"/>
-                <w:sz w:val="22"/>
-              </w:rPr>
-              <w:t>District Website</w:t>
-            </w:r>
-          </w:p>
-        </w:tc>
-        <w:tc>
-          <w:tcPr>
-            <w:tcW w:type="dxa" w:w="4724"/>
-            <w:shd w:val="clear" w:color="auto" w:fill="F4F6FA"/>
-            <w:tcBorders>
-              <w:top w:val="single" w:sz="10" w:color="003F87"/>
-              <w:left w:val="single" w:sz="10" w:color="003F87"/>
-              <w:bottom w:val="single" w:sz="10" w:color="003F87"/>
-              <w:right w:val="single" w:sz="10" w:color="003F87"/>
-            </w:tcBorders>
-            <w:vAlign w:val="center"/>
-          </w:tcPr>
-          <w:p>
-            <w:pPr>
-              <w:jc w:val="left"/>
-            </w:pPr>
-            <w:r>
-              <w:rPr>
-                <w:rFonts w:ascii="Calibri" w:hAnsi="Calibri"/>
-                <w:b/>
-                <w:i w:val="0"/>
-                <w:color w:val="003F87"/>
-                <w:sz w:val="18"/>
-              </w:rPr>
-              <w:t xml:space="preserve"> IMG 5 </w:t>
-            </w:r>
-          </w:p>
-          <w:p>
-            <w:pPr>
-              <w:jc w:val="center"/>
-            </w:pPr>
-            <w:r>
-              <w:rPr>
-                <w:rFonts w:ascii="Calibri" w:hAnsi="Calibri"/>
-                <w:b w:val="0"/>
-                <w:i/>
-                <w:color w:val="2B2B2B"/>
-                <w:sz w:val="20"/>
-              </w:rPr>
-              <w:t>[ Insert Photo ]</w:t>
-            </w:r>
-          </w:p>
-          <w:p>
-            <w:pPr>
-              <w:jc w:val="center"/>
-            </w:pPr>
-            <w:r>
-              <w:rPr>
-                <w:rFonts w:ascii="Calibri" w:hAnsi="Calibri"/>
-                <w:b/>
-                <w:i w:val="0"/>
-                <w:color w:val="003F87"/>
-                <w:sz w:val="22"/>
-              </w:rPr>
-              <w:t>MyLion App</w:t>
-            </w:r>
-          </w:p>
-        </w:tc>
-        <w:tc>
-          <w:tcPr>
-            <w:tcW w:type="dxa" w:w="4724"/>
-            <w:shd w:val="clear" w:color="auto" w:fill="F4F6FA"/>
-            <w:tcBorders>
-              <w:top w:val="single" w:sz="10" w:color="003F87"/>
-              <w:left w:val="single" w:sz="10" w:color="003F87"/>
-              <w:bottom w:val="single" w:sz="10" w:color="003F87"/>
-              <w:right w:val="single" w:sz="10" w:color="003F87"/>
-            </w:tcBorders>
-            <w:vAlign w:val="center"/>
-          </w:tcPr>
-          <w:p>
-            <w:pPr>
-              <w:jc w:val="left"/>
-            </w:pPr>
-            <w:r>
-              <w:rPr>
-                <w:rFonts w:ascii="Calibri" w:hAnsi="Calibri"/>
-                <w:b/>
-                <w:i w:val="0"/>
-                <w:color w:val="003F87"/>
-                <w:sz w:val="18"/>
-              </w:rPr>
-              <w:t xml:space="preserve"> IMG 6 </w:t>
-            </w:r>
-          </w:p>
-          <w:p>
-            <w:pPr>
-              <w:jc w:val="center"/>
-            </w:pPr>
-            <w:r>
-              <w:rPr>
-                <w:rFonts w:ascii="Calibri" w:hAnsi="Calibri"/>
-                <w:b w:val="0"/>
-                <w:i/>
-                <w:color w:val="2B2B2B"/>
-                <w:sz w:val="20"/>
-              </w:rPr>
-              <w:t>[ Insert Photo ]</w:t>
-            </w:r>
-          </w:p>
-          <w:p>
-            <w:pPr>
-              <w:jc w:val="center"/>
-            </w:pPr>
-            <w:r>
-              <w:rPr>
-                <w:rFonts w:ascii="Calibri" w:hAnsi="Calibri"/>
-                <w:b/>
-                <w:i w:val="0"/>
-                <w:color w:val="003F87"/>
-                <w:sz w:val="22"/>
-              </w:rPr>
-              <w:t>Brand Kit</w:t>
-            </w:r>
-          </w:p>
-        </w:tc>
-      </w:tr>
-    </w:tbl>
-    <w:p>
-      <w:pPr>
-        <w:jc w:val="center"/>
-      </w:pPr>
-      <w:r>
-        <w:rPr>
-          <w:rFonts w:ascii="Calibri" w:hAnsi="Calibri"/>
-          <w:b/>
-          <w:i w:val="0"/>
-          <w:color w:val="003F87"/>
-          <w:sz w:val="20"/>
-        </w:rPr>
-        <w:t>We Serve — Powered by Technology   ·   2 / 6</w:t>
-      </w:r>
-    </w:p>
-    <w:p>
-      <w:r>
-        <w:br w:type="page"/>
-      </w:r>
-    </w:p>
-    <w:tbl>
-      <w:tblPr>
-        <w:tblW w:type="auto" w:w="0"/>
-        <w:tblLayout w:type="fixed"/>
-        <w:tblLook w:firstColumn="1" w:firstRow="1" w:lastColumn="0" w:lastRow="0" w:noHBand="0" w:noVBand="1" w:val="04A0"/>
-      </w:tblPr>
-      <w:tblGrid>
-        <w:gridCol w:w="7070"/>
-        <w:gridCol w:w="7070"/>
-      </w:tblGrid>
-      <w:tr>
-        <w:tc>
-          <w:tcPr>
-            <w:tcW w:type="dxa" w:w="7087"/>
-            <w:shd w:val="clear" w:color="auto" w:fill="003F87"/>
-            <w:tcBorders>
-              <w:top w:val="single" w:sz="12" w:color="FFC72C"/>
-              <w:left w:val="single" w:sz="12" w:color="FFC72C"/>
-              <w:bottom w:val="single" w:sz="12" w:color="FFC72C"/>
-              <w:right w:val="single" w:sz="12" w:color="FFC72C"/>
-            </w:tcBorders>
-            <w:vAlign w:val="center"/>
-          </w:tcPr>
-          <w:p>
-            <w:pPr>
-              <w:jc w:val="center"/>
-            </w:pPr>
-            <w:r>
-              <w:rPr>
-                <w:rFonts w:ascii="Calibri" w:hAnsi="Calibri"/>
-                <w:b/>
-                <w:i w:val="0"/>
-                <w:color w:val="FFFFFF"/>
-                <w:sz w:val="28"/>
-              </w:rPr>
-              <w:t>DIST 3232F1</w:t>
-            </w:r>
-          </w:p>
-        </w:tc>
-        <w:tc>
-          <w:tcPr>
-            <w:tcW w:type="dxa" w:w="7087"/>
-            <w:shd w:val="clear" w:color="auto" w:fill="003F87"/>
-            <w:tcBorders>
-              <w:top w:val="single" w:sz="12" w:color="FFC72C"/>
-              <w:left w:val="single" w:sz="12" w:color="FFC72C"/>
-              <w:bottom w:val="single" w:sz="12" w:color="FFC72C"/>
-              <w:right w:val="single" w:sz="12" w:color="FFC72C"/>
-            </w:tcBorders>
-            <w:vAlign w:val="center"/>
-          </w:tcPr>
-          <w:p>
-            <w:pPr>
-              <w:jc w:val="center"/>
-            </w:pPr>
-            <w:r>
-              <w:rPr>
-                <w:rFonts w:ascii="Calibri" w:hAnsi="Calibri"/>
-                <w:b/>
-                <w:i w:val="0"/>
-                <w:color w:val="FFFFFF"/>
-                <w:sz w:val="28"/>
-              </w:rPr>
-              <w:t>LCI</w:t>
-            </w:r>
-          </w:p>
-        </w:tc>
-      </w:tr>
-    </w:tbl>
-    <w:p>
-      <w:pPr>
-        <w:jc w:val="center"/>
-      </w:pPr>
-      <w:r>
-        <w:rPr>
-          <w:rFonts w:ascii="Calibri" w:hAnsi="Calibri"/>
-          <w:b/>
-          <w:i w:val="0"/>
-          <w:color w:val="003F87"/>
-          <w:sz w:val="24"/>
-        </w:rPr>
-        <w:t>LIONS INTERNATIONAL · DISTRICT 3232F1</w:t>
-      </w:r>
-    </w:p>
-    <w:p>
-      <w:pPr>
-        <w:jc w:val="center"/>
-      </w:pPr>
-      <w:r>
-        <w:rPr>
-          <w:rFonts w:ascii="Calibri" w:hAnsi="Calibri"/>
-          <w:b w:val="0"/>
-          <w:i/>
-          <w:color w:val="2B2B2B"/>
-          <w:sz w:val="20"/>
-        </w:rPr>
-        <w:t>A-19 District Information Technology Chairperson</w:t>
-      </w:r>
-    </w:p>
-    <w:p>
-      <w:r>
-        <w:rPr>
-          <w:rFonts w:ascii="Calibri" w:hAnsi="Calibri"/>
-          <w:b/>
-          <w:i w:val="0"/>
-          <w:color w:val="003F87"/>
-          <w:sz w:val="20"/>
-        </w:rPr>
-        <w:t xml:space="preserve">  PAGE 3 · TOPIC 3  </w:t>
-      </w:r>
-    </w:p>
-    <w:p>
-      <w:r>
-        <w:rPr>
-          <w:rFonts w:ascii="Calibri" w:hAnsi="Calibri"/>
-          <w:b/>
-          <w:i w:val="0"/>
-          <w:color w:val="003F87"/>
-          <w:sz w:val="44"/>
-        </w:rPr>
-        <w:t>Preparation &amp; Implementation of District IT Goals</w:t>
-      </w:r>
-    </w:p>
-    <w:p>
-      <w:r>
-        <w:rPr>
-          <w:rFonts w:ascii="Calibri" w:hAnsi="Calibri"/>
-          <w:b w:val="0"/>
-          <w:i/>
-          <w:color w:val="2B2B2B"/>
-          <w:sz w:val="24"/>
-        </w:rPr>
-        <w:t>Plan · Execute · Monitor</w:t>
-      </w:r>
-    </w:p>
-    <w:p>
-      <w:pPr>
-        <w:pStyle w:val="ListBullet"/>
-      </w:pPr>
-      <w:r>
-        <w:rPr>
-          <w:rFonts w:ascii="Calibri" w:hAnsi="Calibri"/>
-          <w:b w:val="0"/>
-          <w:i w:val="0"/>
-          <w:color w:val="2B2B2B"/>
-          <w:sz w:val="22"/>
-        </w:rPr>
-        <w:t>Annual IT roadmap aligned to DG's theme</w:t>
-      </w:r>
-    </w:p>
-    <w:p>
-      <w:pPr>
-        <w:pStyle w:val="ListBullet"/>
-      </w:pPr>
-      <w:r>
-        <w:rPr>
-          <w:rFonts w:ascii="Calibri" w:hAnsi="Calibri"/>
-          <w:b w:val="0"/>
-          <w:i w:val="0"/>
-          <w:color w:val="2B2B2B"/>
-          <w:sz w:val="22"/>
-        </w:rPr>
-        <w:t>Quarterly milestones with club-level targets</w:t>
-      </w:r>
-    </w:p>
-    <w:p>
-      <w:pPr>
-        <w:pStyle w:val="ListBullet"/>
-      </w:pPr>
-      <w:r>
-        <w:rPr>
-          <w:rFonts w:ascii="Calibri" w:hAnsi="Calibri"/>
-          <w:b w:val="0"/>
-          <w:i w:val="0"/>
-          <w:color w:val="2B2B2B"/>
-          <w:sz w:val="22"/>
-        </w:rPr>
-        <w:t>100% MMR compliance across every club</w:t>
-      </w:r>
-    </w:p>
-    <w:p>
-      <w:pPr>
-        <w:pStyle w:val="ListBullet"/>
-      </w:pPr>
-      <w:r>
-        <w:rPr>
-          <w:rFonts w:ascii="Calibri" w:hAnsi="Calibri"/>
-          <w:b w:val="0"/>
-          <w:i w:val="0"/>
-          <w:color w:val="2B2B2B"/>
-          <w:sz w:val="22"/>
-        </w:rPr>
-        <w:t>Every club onboarded with website + social presence</w:t>
-      </w:r>
-    </w:p>
-    <w:p>
-      <w:pPr>
-        <w:pStyle w:val="ListBullet"/>
-      </w:pPr>
-      <w:r>
-        <w:rPr>
-          <w:rFonts w:ascii="Calibri" w:hAnsi="Calibri"/>
-          <w:b w:val="0"/>
-          <w:i w:val="0"/>
-          <w:color w:val="2B2B2B"/>
-          <w:sz w:val="22"/>
-        </w:rPr>
-        <w:t>Real-time dashboards for the Cabinet</w:t>
-      </w:r>
-    </w:p>
-    <w:p>
-      <w:pPr>
-        <w:pStyle w:val="ListBullet"/>
-      </w:pPr>
-      <w:r>
-        <w:rPr>
-          <w:rFonts w:ascii="Calibri" w:hAnsi="Calibri"/>
-          <w:b w:val="0"/>
-          <w:i w:val="0"/>
-          <w:color w:val="2B2B2B"/>
-          <w:sz w:val="22"/>
-        </w:rPr>
-        <w:t>Zero data incidents — security &amp; backups audited</w:t>
-      </w:r>
-    </w:p>
-    <w:tbl>
-      <w:tblPr>
-        <w:tblW w:type="auto" w:w="0"/>
-        <w:tblLayout w:type="fixed"/>
-        <w:tblLook w:firstColumn="1" w:firstRow="1" w:lastColumn="0" w:lastRow="0" w:noHBand="0" w:noVBand="1" w:val="04A0"/>
-      </w:tblPr>
-      <w:tblGrid>
-        <w:gridCol w:w="4713"/>
-        <w:gridCol w:w="4713"/>
-        <w:gridCol w:w="4713"/>
-      </w:tblGrid>
-      <w:tr>
-        <w:trPr>
-          <w:trHeight w:val="2835"/>
-        </w:trPr>
-        <w:tc>
-          <w:tcPr>
-            <w:tcW w:type="dxa" w:w="4724"/>
-            <w:shd w:val="clear" w:color="auto" w:fill="F4F6FA"/>
-            <w:tcBorders>
-              <w:top w:val="single" w:sz="10" w:color="003F87"/>
-              <w:left w:val="single" w:sz="10" w:color="003F87"/>
-              <w:bottom w:val="single" w:sz="10" w:color="003F87"/>
-              <w:right w:val="single" w:sz="10" w:color="003F87"/>
-            </w:tcBorders>
-            <w:vAlign w:val="center"/>
-          </w:tcPr>
-          <w:p>
-            <w:pPr>
-              <w:jc w:val="left"/>
-            </w:pPr>
-            <w:r>
-              <w:rPr>
-                <w:rFonts w:ascii="Calibri" w:hAnsi="Calibri"/>
-                <w:b/>
-                <w:i w:val="0"/>
-                <w:color w:val="003F87"/>
-                <w:sz w:val="18"/>
-              </w:rPr>
-              <w:t xml:space="preserve"> IMG 1 </w:t>
-            </w:r>
-          </w:p>
-          <w:p>
-            <w:pPr>
-              <w:jc w:val="center"/>
-            </w:pPr>
-            <w:r>
-              <w:rPr>
-                <w:rFonts w:ascii="Calibri" w:hAnsi="Calibri"/>
-                <w:b w:val="0"/>
-                <w:i/>
-                <w:color w:val="2B2B2B"/>
-                <w:sz w:val="20"/>
-              </w:rPr>
-              <w:t>[ Insert Photo ]</w:t>
-            </w:r>
-          </w:p>
-          <w:p>
-            <w:pPr>
-              <w:jc w:val="center"/>
-            </w:pPr>
-            <w:r>
-              <w:rPr>
-                <w:rFonts w:ascii="Calibri" w:hAnsi="Calibri"/>
-                <w:b/>
-                <w:i w:val="0"/>
-                <w:color w:val="003F87"/>
-                <w:sz w:val="22"/>
-              </w:rPr>
-              <w:t>Cabinet Meet</w:t>
-            </w:r>
-          </w:p>
-        </w:tc>
-        <w:tc>
-          <w:tcPr>
-            <w:tcW w:type="dxa" w:w="4724"/>
-            <w:shd w:val="clear" w:color="auto" w:fill="F4F6FA"/>
-            <w:tcBorders>
-              <w:top w:val="single" w:sz="10" w:color="003F87"/>
-              <w:left w:val="single" w:sz="10" w:color="003F87"/>
-              <w:bottom w:val="single" w:sz="10" w:color="003F87"/>
-              <w:right w:val="single" w:sz="10" w:color="003F87"/>
-            </w:tcBorders>
-            <w:vAlign w:val="center"/>
-          </w:tcPr>
-          <w:p>
-            <w:pPr>
-              <w:jc w:val="left"/>
-            </w:pPr>
-            <w:r>
-              <w:rPr>
-                <w:rFonts w:ascii="Calibri" w:hAnsi="Calibri"/>
-                <w:b/>
-                <w:i w:val="0"/>
-                <w:color w:val="003F87"/>
-                <w:sz w:val="18"/>
-              </w:rPr>
-              <w:t xml:space="preserve"> IMG 2 </w:t>
-            </w:r>
-          </w:p>
-          <w:p>
-            <w:pPr>
-              <w:jc w:val="center"/>
-            </w:pPr>
-            <w:r>
-              <w:rPr>
-                <w:rFonts w:ascii="Calibri" w:hAnsi="Calibri"/>
-                <w:b w:val="0"/>
-                <w:i/>
-                <w:color w:val="2B2B2B"/>
-                <w:sz w:val="20"/>
-              </w:rPr>
-              <w:t>[ Insert Photo ]</w:t>
-            </w:r>
-          </w:p>
-          <w:p>
-            <w:pPr>
-              <w:jc w:val="center"/>
-            </w:pPr>
-            <w:r>
-              <w:rPr>
-                <w:rFonts w:ascii="Calibri" w:hAnsi="Calibri"/>
-                <w:b/>
-                <w:i w:val="0"/>
-                <w:color w:val="003F87"/>
-                <w:sz w:val="22"/>
-              </w:rPr>
-              <w:t>IT Goals Chart</w:t>
-            </w:r>
-          </w:p>
-        </w:tc>
-        <w:tc>
-          <w:tcPr>
-            <w:tcW w:type="dxa" w:w="4724"/>
-            <w:shd w:val="clear" w:color="auto" w:fill="F4F6FA"/>
-            <w:tcBorders>
-              <w:top w:val="single" w:sz="10" w:color="003F87"/>
-              <w:left w:val="single" w:sz="10" w:color="003F87"/>
-              <w:bottom w:val="single" w:sz="10" w:color="003F87"/>
-              <w:right w:val="single" w:sz="10" w:color="003F87"/>
-            </w:tcBorders>
-            <w:vAlign w:val="center"/>
-          </w:tcPr>
-          <w:p>
-            <w:pPr>
-              <w:jc w:val="left"/>
-            </w:pPr>
-            <w:r>
-              <w:rPr>
-                <w:rFonts w:ascii="Calibri" w:hAnsi="Calibri"/>
-                <w:b/>
-                <w:i w:val="0"/>
-                <w:color w:val="003F87"/>
-                <w:sz w:val="18"/>
-              </w:rPr>
-              <w:t xml:space="preserve"> IMG 3 </w:t>
-            </w:r>
-          </w:p>
-          <w:p>
-            <w:pPr>
-              <w:jc w:val="center"/>
-            </w:pPr>
-            <w:r>
-              <w:rPr>
-                <w:rFonts w:ascii="Calibri" w:hAnsi="Calibri"/>
-                <w:b w:val="0"/>
-                <w:i/>
-                <w:color w:val="2B2B2B"/>
-                <w:sz w:val="20"/>
-              </w:rPr>
-              <w:t>[ Insert Photo ]</w:t>
-            </w:r>
-          </w:p>
-          <w:p>
-            <w:pPr>
-              <w:jc w:val="center"/>
-            </w:pPr>
-            <w:r>
-              <w:rPr>
-                <w:rFonts w:ascii="Calibri" w:hAnsi="Calibri"/>
-                <w:b/>
-                <w:i w:val="0"/>
-                <w:color w:val="003F87"/>
-                <w:sz w:val="22"/>
-              </w:rPr>
-              <w:t>Roadmap</w:t>
-            </w:r>
-          </w:p>
-        </w:tc>
-      </w:tr>
-      <w:tr>
-        <w:trPr>
-          <w:trHeight w:val="2835"/>
-        </w:trPr>
-        <w:tc>
-          <w:tcPr>
-            <w:tcW w:type="dxa" w:w="4724"/>
-            <w:shd w:val="clear" w:color="auto" w:fill="F4F6FA"/>
-            <w:tcBorders>
-              <w:top w:val="single" w:sz="10" w:color="003F87"/>
-              <w:left w:val="single" w:sz="10" w:color="003F87"/>
-              <w:bottom w:val="single" w:sz="10" w:color="003F87"/>
-              <w:right w:val="single" w:sz="10" w:color="003F87"/>
-            </w:tcBorders>
-            <w:vAlign w:val="center"/>
-          </w:tcPr>
-          <w:p>
-            <w:pPr>
-              <w:jc w:val="left"/>
-            </w:pPr>
-            <w:r>
-              <w:rPr>
-                <w:rFonts w:ascii="Calibri" w:hAnsi="Calibri"/>
-                <w:b/>
-                <w:i w:val="0"/>
-                <w:color w:val="003F87"/>
-                <w:sz w:val="18"/>
-              </w:rPr>
-              <w:t xml:space="preserve"> IMG 4 </w:t>
-            </w:r>
-          </w:p>
-          <w:p>
-            <w:pPr>
-              <w:jc w:val="center"/>
-            </w:pPr>
-            <w:r>
-              <w:rPr>
-                <w:rFonts w:ascii="Calibri" w:hAnsi="Calibri"/>
-                <w:b w:val="0"/>
-                <w:i/>
-                <w:color w:val="2B2B2B"/>
-                <w:sz w:val="20"/>
-              </w:rPr>
-              <w:t>[ Insert Photo ]</w:t>
-            </w:r>
-          </w:p>
-          <w:p>
-            <w:pPr>
-              <w:jc w:val="center"/>
-            </w:pPr>
-            <w:r>
-              <w:rPr>
-                <w:rFonts w:ascii="Calibri" w:hAnsi="Calibri"/>
-                <w:b/>
-                <w:i w:val="0"/>
-                <w:color w:val="003F87"/>
-                <w:sz w:val="22"/>
-              </w:rPr>
-              <w:t>Dashboard</w:t>
-            </w:r>
-          </w:p>
-        </w:tc>
-        <w:tc>
-          <w:tcPr>
-            <w:tcW w:type="dxa" w:w="4724"/>
-            <w:shd w:val="clear" w:color="auto" w:fill="F4F6FA"/>
-            <w:tcBorders>
-              <w:top w:val="single" w:sz="10" w:color="003F87"/>
-              <w:left w:val="single" w:sz="10" w:color="003F87"/>
-              <w:bottom w:val="single" w:sz="10" w:color="003F87"/>
-              <w:right w:val="single" w:sz="10" w:color="003F87"/>
-            </w:tcBorders>
-            <w:vAlign w:val="center"/>
-          </w:tcPr>
-          <w:p>
-            <w:pPr>
-              <w:jc w:val="left"/>
-            </w:pPr>
-            <w:r>
-              <w:rPr>
-                <w:rFonts w:ascii="Calibri" w:hAnsi="Calibri"/>
-                <w:b/>
-                <w:i w:val="0"/>
-                <w:color w:val="003F87"/>
-                <w:sz w:val="18"/>
-              </w:rPr>
-              <w:t xml:space="preserve"> IMG 5 </w:t>
-            </w:r>
-          </w:p>
-          <w:p>
-            <w:pPr>
-              <w:jc w:val="center"/>
-            </w:pPr>
-            <w:r>
-              <w:rPr>
-                <w:rFonts w:ascii="Calibri" w:hAnsi="Calibri"/>
-                <w:b w:val="0"/>
-                <w:i/>
-                <w:color w:val="2B2B2B"/>
-                <w:sz w:val="20"/>
-              </w:rPr>
-              <w:t>[ Insert Photo ]</w:t>
-            </w:r>
-          </w:p>
-          <w:p>
-            <w:pPr>
-              <w:jc w:val="center"/>
-            </w:pPr>
-            <w:r>
-              <w:rPr>
-                <w:rFonts w:ascii="Calibri" w:hAnsi="Calibri"/>
-                <w:b/>
-                <w:i w:val="0"/>
-                <w:color w:val="003F87"/>
-                <w:sz w:val="22"/>
-              </w:rPr>
-              <w:t>Quarterly Review</w:t>
-            </w:r>
-          </w:p>
-        </w:tc>
-        <w:tc>
-          <w:tcPr>
-            <w:tcW w:type="dxa" w:w="4724"/>
-            <w:shd w:val="clear" w:color="auto" w:fill="F4F6FA"/>
-            <w:tcBorders>
-              <w:top w:val="single" w:sz="10" w:color="003F87"/>
-              <w:left w:val="single" w:sz="10" w:color="003F87"/>
-              <w:bottom w:val="single" w:sz="10" w:color="003F87"/>
-              <w:right w:val="single" w:sz="10" w:color="003F87"/>
-            </w:tcBorders>
-            <w:vAlign w:val="center"/>
-          </w:tcPr>
-          <w:p>
-            <w:pPr>
-              <w:jc w:val="left"/>
-            </w:pPr>
-            <w:r>
-              <w:rPr>
-                <w:rFonts w:ascii="Calibri" w:hAnsi="Calibri"/>
-                <w:b/>
-                <w:i w:val="0"/>
-                <w:color w:val="003F87"/>
-                <w:sz w:val="18"/>
-              </w:rPr>
-              <w:t xml:space="preserve"> IMG 6 </w:t>
-            </w:r>
-          </w:p>
-          <w:p>
-            <w:pPr>
-              <w:jc w:val="center"/>
-            </w:pPr>
-            <w:r>
-              <w:rPr>
-                <w:rFonts w:ascii="Calibri" w:hAnsi="Calibri"/>
-                <w:b w:val="0"/>
-                <w:i/>
-                <w:color w:val="2B2B2B"/>
-                <w:sz w:val="20"/>
-              </w:rPr>
-              <w:t>[ Insert Photo ]</w:t>
-            </w:r>
-          </w:p>
-          <w:p>
-            <w:pPr>
-              <w:jc w:val="center"/>
-            </w:pPr>
-            <w:r>
-              <w:rPr>
-                <w:rFonts w:ascii="Calibri" w:hAnsi="Calibri"/>
-                <w:b/>
-                <w:i w:val="0"/>
-                <w:color w:val="003F87"/>
-                <w:sz w:val="22"/>
-              </w:rPr>
-              <w:t>Audit Report</w:t>
-            </w:r>
-          </w:p>
-        </w:tc>
-      </w:tr>
-    </w:tbl>
-    <w:p>
-      <w:pPr>
-        <w:jc w:val="center"/>
-      </w:pPr>
-      <w:r>
-        <w:rPr>
-          <w:rFonts w:ascii="Calibri" w:hAnsi="Calibri"/>
-          <w:b/>
-          <w:i w:val="0"/>
-          <w:color w:val="003F87"/>
-          <w:sz w:val="20"/>
-        </w:rPr>
-        <w:t>We Serve — Powered by Technology   ·   3 / 6</w:t>
-      </w:r>
-    </w:p>
-    <w:p>
-      <w:r>
-        <w:br w:type="page"/>
-      </w:r>
-    </w:p>
-    <w:tbl>
-      <w:tblPr>
-        <w:tblW w:type="auto" w:w="0"/>
-        <w:tblLayout w:type="fixed"/>
-        <w:tblLook w:firstColumn="1" w:firstRow="1" w:lastColumn="0" w:lastRow="0" w:noHBand="0" w:noVBand="1" w:val="04A0"/>
-      </w:tblPr>
-      <w:tblGrid>
-        <w:gridCol w:w="7070"/>
-        <w:gridCol w:w="7070"/>
-      </w:tblGrid>
-      <w:tr>
-        <w:tc>
-          <w:tcPr>
-            <w:tcW w:type="dxa" w:w="7087"/>
-            <w:shd w:val="clear" w:color="auto" w:fill="003F87"/>
-            <w:tcBorders>
-              <w:top w:val="single" w:sz="12" w:color="FFC72C"/>
-              <w:left w:val="single" w:sz="12" w:color="FFC72C"/>
-              <w:bottom w:val="single" w:sz="12" w:color="FFC72C"/>
-              <w:right w:val="single" w:sz="12" w:color="FFC72C"/>
-            </w:tcBorders>
-            <w:vAlign w:val="center"/>
-          </w:tcPr>
-          <w:p>
-            <w:pPr>
-              <w:jc w:val="center"/>
-            </w:pPr>
-            <w:r>
-              <w:rPr>
-                <w:rFonts w:ascii="Calibri" w:hAnsi="Calibri"/>
-                <w:b/>
-                <w:i w:val="0"/>
-                <w:color w:val="FFFFFF"/>
-                <w:sz w:val="28"/>
-              </w:rPr>
-              <w:t>DIST 3232F1</w:t>
-            </w:r>
-          </w:p>
-        </w:tc>
-        <w:tc>
-          <w:tcPr>
-            <w:tcW w:type="dxa" w:w="7087"/>
-            <w:shd w:val="clear" w:color="auto" w:fill="003F87"/>
-            <w:tcBorders>
-              <w:top w:val="single" w:sz="12" w:color="FFC72C"/>
-              <w:left w:val="single" w:sz="12" w:color="FFC72C"/>
-              <w:bottom w:val="single" w:sz="12" w:color="FFC72C"/>
-              <w:right w:val="single" w:sz="12" w:color="FFC72C"/>
-            </w:tcBorders>
-            <w:vAlign w:val="center"/>
-          </w:tcPr>
-          <w:p>
-            <w:pPr>
-              <w:jc w:val="center"/>
-            </w:pPr>
-            <w:r>
-              <w:rPr>
-                <w:rFonts w:ascii="Calibri" w:hAnsi="Calibri"/>
-                <w:b/>
-                <w:i w:val="0"/>
-                <w:color w:val="FFFFFF"/>
-                <w:sz w:val="28"/>
-              </w:rPr>
-              <w:t>LCI</w:t>
-            </w:r>
-          </w:p>
-        </w:tc>
-      </w:tr>
-    </w:tbl>
-    <w:p>
-      <w:pPr>
-        <w:jc w:val="center"/>
-      </w:pPr>
-      <w:r>
-        <w:rPr>
-          <w:rFonts w:ascii="Calibri" w:hAnsi="Calibri"/>
-          <w:b/>
-          <w:i w:val="0"/>
-          <w:color w:val="003F87"/>
-          <w:sz w:val="24"/>
-        </w:rPr>
-        <w:t>LIONS INTERNATIONAL · DISTRICT 3232F1</w:t>
-      </w:r>
-    </w:p>
-    <w:p>
-      <w:pPr>
-        <w:jc w:val="center"/>
-      </w:pPr>
-      <w:r>
-        <w:rPr>
-          <w:rFonts w:ascii="Calibri" w:hAnsi="Calibri"/>
-          <w:b w:val="0"/>
-          <w:i/>
-          <w:color w:val="2B2B2B"/>
-          <w:sz w:val="20"/>
-        </w:rPr>
-        <w:t>A-19 District Information Technology Chairperson</w:t>
-      </w:r>
-    </w:p>
-    <w:p>
-      <w:r>
-        <w:rPr>
-          <w:rFonts w:ascii="Calibri" w:hAnsi="Calibri"/>
-          <w:b/>
-          <w:i w:val="0"/>
-          <w:color w:val="003F87"/>
-          <w:sz w:val="20"/>
-        </w:rPr>
-        <w:t xml:space="preserve">  PAGE 4 · TOPIC 4  </w:t>
-      </w:r>
-    </w:p>
-    <w:p>
-      <w:r>
-        <w:rPr>
-          <w:rFonts w:ascii="Calibri" w:hAnsi="Calibri"/>
-          <w:b/>
-          <w:i w:val="0"/>
-          <w:color w:val="003F87"/>
-          <w:sz w:val="44"/>
-        </w:rPr>
-        <w:t>E-Directory · Website · E-Club House · Multimedia</w:t>
-      </w:r>
-    </w:p>
-    <w:p>
-      <w:r>
-        <w:rPr>
-          <w:rFonts w:ascii="Calibri" w:hAnsi="Calibri"/>
-          <w:b w:val="0"/>
-          <w:i/>
-          <w:color w:val="2B2B2B"/>
-          <w:sz w:val="24"/>
-        </w:rPr>
-        <w:t>Club · Zone · Region · District Level</w:t>
-      </w:r>
-    </w:p>
-    <w:p>
-      <w:pPr>
-        <w:pStyle w:val="ListBullet"/>
-      </w:pPr>
-      <w:r>
-        <w:rPr>
-          <w:rFonts w:ascii="Calibri" w:hAnsi="Calibri"/>
-          <w:b w:val="0"/>
-          <w:i w:val="0"/>
-          <w:color w:val="2B2B2B"/>
-          <w:sz w:val="22"/>
-        </w:rPr>
-        <w:t>E-Directory — searchable, role-aware, mobile-ready</w:t>
-      </w:r>
-    </w:p>
-    <w:p>
-      <w:pPr>
-        <w:pStyle w:val="ListBullet"/>
-      </w:pPr>
-      <w:r>
-        <w:rPr>
-          <w:rFonts w:ascii="Calibri" w:hAnsi="Calibri"/>
-          <w:b w:val="0"/>
-          <w:i w:val="0"/>
-          <w:color w:val="2B2B2B"/>
-          <w:sz w:val="22"/>
-        </w:rPr>
-        <w:t>Website — district + 50+ club micro-sites, unified brand</w:t>
-      </w:r>
-    </w:p>
-    <w:p>
-      <w:pPr>
-        <w:pStyle w:val="ListBullet"/>
-      </w:pPr>
-      <w:r>
-        <w:rPr>
-          <w:rFonts w:ascii="Calibri" w:hAnsi="Calibri"/>
-          <w:b w:val="0"/>
-          <w:i w:val="0"/>
-          <w:color w:val="2B2B2B"/>
-          <w:sz w:val="22"/>
-        </w:rPr>
-        <w:t>E-Club House — virtual meets, RSVPs, QR check-ins</w:t>
-      </w:r>
-    </w:p>
-    <w:p>
-      <w:pPr>
-        <w:pStyle w:val="ListBullet"/>
-      </w:pPr>
-      <w:r>
-        <w:rPr>
-          <w:rFonts w:ascii="Calibri" w:hAnsi="Calibri"/>
-          <w:b w:val="0"/>
-          <w:i w:val="0"/>
-          <w:color w:val="2B2B2B"/>
-          <w:sz w:val="22"/>
-        </w:rPr>
-        <w:t>Multimedia — photo &amp; video archive at every level</w:t>
-      </w:r>
-    </w:p>
-    <w:p>
-      <w:pPr>
-        <w:pStyle w:val="ListBullet"/>
-      </w:pPr>
-      <w:r>
-        <w:rPr>
-          <w:rFonts w:ascii="Calibri" w:hAnsi="Calibri"/>
-          <w:b w:val="0"/>
-          <w:i w:val="0"/>
-          <w:color w:val="2B2B2B"/>
-          <w:sz w:val="22"/>
-        </w:rPr>
-        <w:t>Brand-safe templates: posters, certificates, social cards</w:t>
-      </w:r>
-    </w:p>
-    <w:p>
-      <w:pPr>
-        <w:pStyle w:val="ListBullet"/>
-      </w:pPr>
-      <w:r>
-        <w:rPr>
-          <w:rFonts w:ascii="Calibri" w:hAnsi="Calibri"/>
-          <w:b w:val="0"/>
-          <w:i w:val="0"/>
-          <w:color w:val="2B2B2B"/>
-          <w:sz w:val="22"/>
-        </w:rPr>
-        <w:t>Self-service publishing: clubs go live in minutes</w:t>
-      </w:r>
-    </w:p>
-    <w:tbl>
-      <w:tblPr>
-        <w:tblW w:type="auto" w:w="0"/>
-        <w:tblLayout w:type="fixed"/>
-        <w:tblLook w:firstColumn="1" w:firstRow="1" w:lastColumn="0" w:lastRow="0" w:noHBand="0" w:noVBand="1" w:val="04A0"/>
-      </w:tblPr>
-      <w:tblGrid>
-        <w:gridCol w:w="4713"/>
-        <w:gridCol w:w="4713"/>
-        <w:gridCol w:w="4713"/>
-      </w:tblGrid>
-      <w:tr>
-        <w:trPr>
-          <w:trHeight w:val="2835"/>
-        </w:trPr>
-        <w:tc>
-          <w:tcPr>
-            <w:tcW w:type="dxa" w:w="4724"/>
-            <w:shd w:val="clear" w:color="auto" w:fill="F4F6FA"/>
-            <w:tcBorders>
-              <w:top w:val="single" w:sz="10" w:color="003F87"/>
-              <w:left w:val="single" w:sz="10" w:color="003F87"/>
-              <w:bottom w:val="single" w:sz="10" w:color="003F87"/>
-              <w:right w:val="single" w:sz="10" w:color="003F87"/>
-            </w:tcBorders>
-            <w:vAlign w:val="center"/>
-          </w:tcPr>
-          <w:p>
-            <w:pPr>
-              <w:jc w:val="left"/>
-            </w:pPr>
-            <w:r>
-              <w:rPr>
-                <w:rFonts w:ascii="Calibri" w:hAnsi="Calibri"/>
-                <w:b/>
-                <w:i w:val="0"/>
-                <w:color w:val="003F87"/>
-                <w:sz w:val="18"/>
-              </w:rPr>
-              <w:t xml:space="preserve"> IMG 1 </w:t>
-            </w:r>
-          </w:p>
-          <w:p>
-            <w:pPr>
-              <w:jc w:val="center"/>
-            </w:pPr>
-            <w:r>
-              <w:rPr>
-                <w:rFonts w:ascii="Calibri" w:hAnsi="Calibri"/>
-                <w:b w:val="0"/>
-                <w:i/>
-                <w:color w:val="2B2B2B"/>
-                <w:sz w:val="20"/>
-              </w:rPr>
-              <w:t>[ Insert Photo ]</w:t>
-            </w:r>
-          </w:p>
-          <w:p>
-            <w:pPr>
-              <w:jc w:val="center"/>
-            </w:pPr>
-            <w:r>
-              <w:rPr>
-                <w:rFonts w:ascii="Calibri" w:hAnsi="Calibri"/>
-                <w:b/>
-                <w:i w:val="0"/>
-                <w:color w:val="003F87"/>
-                <w:sz w:val="22"/>
-              </w:rPr>
-              <w:t>E-Directory</w:t>
-            </w:r>
-          </w:p>
-        </w:tc>
-        <w:tc>
-          <w:tcPr>
-            <w:tcW w:type="dxa" w:w="4724"/>
-            <w:shd w:val="clear" w:color="auto" w:fill="F4F6FA"/>
-            <w:tcBorders>
-              <w:top w:val="single" w:sz="10" w:color="003F87"/>
-              <w:left w:val="single" w:sz="10" w:color="003F87"/>
-              <w:bottom w:val="single" w:sz="10" w:color="003F87"/>
-              <w:right w:val="single" w:sz="10" w:color="003F87"/>
-            </w:tcBorders>
-            <w:vAlign w:val="center"/>
-          </w:tcPr>
-          <w:p>
-            <w:pPr>
-              <w:jc w:val="left"/>
-            </w:pPr>
-            <w:r>
-              <w:rPr>
-                <w:rFonts w:ascii="Calibri" w:hAnsi="Calibri"/>
-                <w:b/>
-                <w:i w:val="0"/>
-                <w:color w:val="003F87"/>
-                <w:sz w:val="18"/>
-              </w:rPr>
-              <w:t xml:space="preserve"> IMG 2 </w:t>
-            </w:r>
-          </w:p>
-          <w:p>
-            <w:pPr>
-              <w:jc w:val="center"/>
-            </w:pPr>
-            <w:r>
-              <w:rPr>
-                <w:rFonts w:ascii="Calibri" w:hAnsi="Calibri"/>
-                <w:b w:val="0"/>
-                <w:i/>
-                <w:color w:val="2B2B2B"/>
-                <w:sz w:val="20"/>
-              </w:rPr>
-              <w:t>[ Insert Photo ]</w:t>
-            </w:r>
-          </w:p>
-          <w:p>
-            <w:pPr>
-              <w:jc w:val="center"/>
-            </w:pPr>
-            <w:r>
-              <w:rPr>
-                <w:rFonts w:ascii="Calibri" w:hAnsi="Calibri"/>
-                <w:b/>
-                <w:i w:val="0"/>
-                <w:color w:val="003F87"/>
-                <w:sz w:val="22"/>
-              </w:rPr>
-              <w:t>Club Website</w:t>
-            </w:r>
-          </w:p>
-        </w:tc>
-        <w:tc>
-          <w:tcPr>
-            <w:tcW w:type="dxa" w:w="4724"/>
-            <w:shd w:val="clear" w:color="auto" w:fill="F4F6FA"/>
-            <w:tcBorders>
-              <w:top w:val="single" w:sz="10" w:color="003F87"/>
-              <w:left w:val="single" w:sz="10" w:color="003F87"/>
-              <w:bottom w:val="single" w:sz="10" w:color="003F87"/>
-              <w:right w:val="single" w:sz="10" w:color="003F87"/>
-            </w:tcBorders>
-            <w:vAlign w:val="center"/>
-          </w:tcPr>
-          <w:p>
-            <w:pPr>
-              <w:jc w:val="left"/>
-            </w:pPr>
-            <w:r>
-              <w:rPr>
-                <w:rFonts w:ascii="Calibri" w:hAnsi="Calibri"/>
-                <w:b/>
-                <w:i w:val="0"/>
-                <w:color w:val="003F87"/>
-                <w:sz w:val="18"/>
-              </w:rPr>
-              <w:t xml:space="preserve"> IMG 3 </w:t>
-            </w:r>
-          </w:p>
-          <w:p>
-            <w:pPr>
-              <w:jc w:val="center"/>
-            </w:pPr>
-            <w:r>
-              <w:rPr>
-                <w:rFonts w:ascii="Calibri" w:hAnsi="Calibri"/>
-                <w:b w:val="0"/>
-                <w:i/>
-                <w:color w:val="2B2B2B"/>
-                <w:sz w:val="20"/>
-              </w:rPr>
-              <w:t>[ Insert Photo ]</w:t>
-            </w:r>
-          </w:p>
-          <w:p>
-            <w:pPr>
-              <w:jc w:val="center"/>
-            </w:pPr>
-            <w:r>
-              <w:rPr>
-                <w:rFonts w:ascii="Calibri" w:hAnsi="Calibri"/>
-                <w:b/>
-                <w:i w:val="0"/>
-                <w:color w:val="003F87"/>
-                <w:sz w:val="22"/>
-              </w:rPr>
-              <w:t>E-Club House</w:t>
-            </w:r>
-          </w:p>
-        </w:tc>
-      </w:tr>
-      <w:tr>
-        <w:trPr>
-          <w:trHeight w:val="2835"/>
-        </w:trPr>
-        <w:tc>
-          <w:tcPr>
-            <w:tcW w:type="dxa" w:w="4724"/>
-            <w:shd w:val="clear" w:color="auto" w:fill="F4F6FA"/>
-            <w:tcBorders>
-              <w:top w:val="single" w:sz="10" w:color="003F87"/>
-              <w:left w:val="single" w:sz="10" w:color="003F87"/>
-              <w:bottom w:val="single" w:sz="10" w:color="003F87"/>
-              <w:right w:val="single" w:sz="10" w:color="003F87"/>
-            </w:tcBorders>
-            <w:vAlign w:val="center"/>
-          </w:tcPr>
-          <w:p>
-            <w:pPr>
-              <w:jc w:val="left"/>
-            </w:pPr>
-            <w:r>
-              <w:rPr>
-                <w:rFonts w:ascii="Calibri" w:hAnsi="Calibri"/>
-                <w:b/>
-                <w:i w:val="0"/>
-                <w:color w:val="003F87"/>
-                <w:sz w:val="18"/>
-              </w:rPr>
-              <w:t xml:space="preserve"> IMG 4 </w:t>
-            </w:r>
-          </w:p>
-          <w:p>
-            <w:pPr>
-              <w:jc w:val="center"/>
-            </w:pPr>
-            <w:r>
-              <w:rPr>
-                <w:rFonts w:ascii="Calibri" w:hAnsi="Calibri"/>
-                <w:b w:val="0"/>
-                <w:i/>
-                <w:color w:val="2B2B2B"/>
-                <w:sz w:val="20"/>
-              </w:rPr>
-              <w:t>[ Insert Photo ]</w:t>
-            </w:r>
-          </w:p>
-          <w:p>
-            <w:pPr>
-              <w:jc w:val="center"/>
-            </w:pPr>
-            <w:r>
-              <w:rPr>
-                <w:rFonts w:ascii="Calibri" w:hAnsi="Calibri"/>
-                <w:b/>
-                <w:i w:val="0"/>
-                <w:color w:val="003F87"/>
-                <w:sz w:val="22"/>
-              </w:rPr>
-              <w:t>Photo Archive</w:t>
-            </w:r>
-          </w:p>
-        </w:tc>
-        <w:tc>
-          <w:tcPr>
-            <w:tcW w:type="dxa" w:w="4724"/>
-            <w:shd w:val="clear" w:color="auto" w:fill="F4F6FA"/>
-            <w:tcBorders>
-              <w:top w:val="single" w:sz="10" w:color="003F87"/>
-              <w:left w:val="single" w:sz="10" w:color="003F87"/>
-              <w:bottom w:val="single" w:sz="10" w:color="003F87"/>
-              <w:right w:val="single" w:sz="10" w:color="003F87"/>
-            </w:tcBorders>
-            <w:vAlign w:val="center"/>
-          </w:tcPr>
-          <w:p>
-            <w:pPr>
-              <w:jc w:val="left"/>
-            </w:pPr>
-            <w:r>
-              <w:rPr>
-                <w:rFonts w:ascii="Calibri" w:hAnsi="Calibri"/>
-                <w:b/>
-                <w:i w:val="0"/>
-                <w:color w:val="003F87"/>
-                <w:sz w:val="18"/>
-              </w:rPr>
-              <w:t xml:space="preserve"> IMG 5 </w:t>
-            </w:r>
-          </w:p>
-          <w:p>
-            <w:pPr>
-              <w:jc w:val="center"/>
-            </w:pPr>
-            <w:r>
-              <w:rPr>
-                <w:rFonts w:ascii="Calibri" w:hAnsi="Calibri"/>
-                <w:b w:val="0"/>
-                <w:i/>
-                <w:color w:val="2B2B2B"/>
-                <w:sz w:val="20"/>
-              </w:rPr>
-              <w:t>[ Insert Photo ]</w:t>
-            </w:r>
-          </w:p>
-          <w:p>
-            <w:pPr>
-              <w:jc w:val="center"/>
-            </w:pPr>
-            <w:r>
-              <w:rPr>
-                <w:rFonts w:ascii="Calibri" w:hAnsi="Calibri"/>
-                <w:b/>
-                <w:i w:val="0"/>
-                <w:color w:val="003F87"/>
-                <w:sz w:val="22"/>
-              </w:rPr>
-              <w:t>Video Reel</w:t>
-            </w:r>
-          </w:p>
-        </w:tc>
-        <w:tc>
-          <w:tcPr>
-            <w:tcW w:type="dxa" w:w="4724"/>
-            <w:shd w:val="clear" w:color="auto" w:fill="F4F6FA"/>
-            <w:tcBorders>
-              <w:top w:val="single" w:sz="10" w:color="003F87"/>
-              <w:left w:val="single" w:sz="10" w:color="003F87"/>
-              <w:bottom w:val="single" w:sz="10" w:color="003F87"/>
-              <w:right w:val="single" w:sz="10" w:color="003F87"/>
-            </w:tcBorders>
-            <w:vAlign w:val="center"/>
-          </w:tcPr>
-          <w:p>
-            <w:pPr>
-              <w:jc w:val="left"/>
-            </w:pPr>
-            <w:r>
-              <w:rPr>
-                <w:rFonts w:ascii="Calibri" w:hAnsi="Calibri"/>
-                <w:b/>
-                <w:i w:val="0"/>
-                <w:color w:val="003F87"/>
-                <w:sz w:val="18"/>
-              </w:rPr>
-              <w:t xml:space="preserve"> IMG 6 </w:t>
-            </w:r>
-          </w:p>
-          <w:p>
-            <w:pPr>
-              <w:jc w:val="center"/>
-            </w:pPr>
-            <w:r>
-              <w:rPr>
-                <w:rFonts w:ascii="Calibri" w:hAnsi="Calibri"/>
-                <w:b w:val="0"/>
-                <w:i/>
-                <w:color w:val="2B2B2B"/>
-                <w:sz w:val="20"/>
-              </w:rPr>
-              <w:t>[ Insert Photo ]</w:t>
-            </w:r>
-          </w:p>
-          <w:p>
-            <w:pPr>
-              <w:jc w:val="center"/>
-            </w:pPr>
-            <w:r>
-              <w:rPr>
-                <w:rFonts w:ascii="Calibri" w:hAnsi="Calibri"/>
-                <w:b/>
-                <w:i w:val="0"/>
-                <w:color w:val="003F87"/>
-                <w:sz w:val="22"/>
-              </w:rPr>
-              <w:t>Template Pack</w:t>
-            </w:r>
-          </w:p>
-        </w:tc>
-      </w:tr>
-    </w:tbl>
-    <w:p>
-      <w:pPr>
-        <w:jc w:val="center"/>
-      </w:pPr>
-      <w:r>
-        <w:rPr>
-          <w:rFonts w:ascii="Calibri" w:hAnsi="Calibri"/>
-          <w:b/>
-          <w:i w:val="0"/>
-          <w:color w:val="003F87"/>
-          <w:sz w:val="20"/>
-        </w:rPr>
-        <w:t>We Serve — Powered by Technology   ·   4 / 6</w:t>
-      </w:r>
-    </w:p>
-    <w:p>
-      <w:r>
-        <w:br w:type="page"/>
-      </w:r>
-    </w:p>
-    <w:tbl>
-      <w:tblPr>
-        <w:tblW w:type="auto" w:w="0"/>
-        <w:tblLayout w:type="fixed"/>
-        <w:tblLook w:firstColumn="1" w:firstRow="1" w:lastColumn="0" w:lastRow="0" w:noHBand="0" w:noVBand="1" w:val="04A0"/>
-      </w:tblPr>
-      <w:tblGrid>
-        <w:gridCol w:w="7070"/>
-        <w:gridCol w:w="7070"/>
-      </w:tblGrid>
-      <w:tr>
-        <w:tc>
-          <w:tcPr>
-            <w:tcW w:type="dxa" w:w="7087"/>
-            <w:shd w:val="clear" w:color="auto" w:fill="003F87"/>
-            <w:tcBorders>
-              <w:top w:val="single" w:sz="12" w:color="FFC72C"/>
-              <w:left w:val="single" w:sz="12" w:color="FFC72C"/>
-              <w:bottom w:val="single" w:sz="12" w:color="FFC72C"/>
-              <w:right w:val="single" w:sz="12" w:color="FFC72C"/>
-            </w:tcBorders>
-            <w:vAlign w:val="center"/>
-          </w:tcPr>
-          <w:p>
-            <w:pPr>
-              <w:jc w:val="center"/>
-            </w:pPr>
-            <w:r>
-              <w:rPr>
-                <w:rFonts w:ascii="Calibri" w:hAnsi="Calibri"/>
-                <w:b/>
-                <w:i w:val="0"/>
-                <w:color w:val="FFFFFF"/>
-                <w:sz w:val="28"/>
-              </w:rPr>
-              <w:t>DIST 3232F1</w:t>
-            </w:r>
-          </w:p>
-        </w:tc>
-        <w:tc>
-          <w:tcPr>
-            <w:tcW w:type="dxa" w:w="7087"/>
-            <w:shd w:val="clear" w:color="auto" w:fill="003F87"/>
-            <w:tcBorders>
-              <w:top w:val="single" w:sz="12" w:color="FFC72C"/>
-              <w:left w:val="single" w:sz="12" w:color="FFC72C"/>
-              <w:bottom w:val="single" w:sz="12" w:color="FFC72C"/>
-              <w:right w:val="single" w:sz="12" w:color="FFC72C"/>
-            </w:tcBorders>
-            <w:vAlign w:val="center"/>
-          </w:tcPr>
-          <w:p>
-            <w:pPr>
-              <w:jc w:val="center"/>
-            </w:pPr>
-            <w:r>
-              <w:rPr>
-                <w:rFonts w:ascii="Calibri" w:hAnsi="Calibri"/>
-                <w:b/>
-                <w:i w:val="0"/>
-                <w:color w:val="FFFFFF"/>
-                <w:sz w:val="28"/>
-              </w:rPr>
-              <w:t>LCI</w:t>
-            </w:r>
-          </w:p>
-        </w:tc>
-      </w:tr>
-    </w:tbl>
-    <w:p>
-      <w:pPr>
-        <w:jc w:val="center"/>
-      </w:pPr>
-      <w:r>
-        <w:rPr>
-          <w:rFonts w:ascii="Calibri" w:hAnsi="Calibri"/>
-          <w:b/>
-          <w:i w:val="0"/>
-          <w:color w:val="003F87"/>
-          <w:sz w:val="24"/>
-        </w:rPr>
-        <w:t>LIONS INTERNATIONAL · DISTRICT 3232F1</w:t>
-      </w:r>
-    </w:p>
-    <w:p>
-      <w:pPr>
-        <w:jc w:val="center"/>
-      </w:pPr>
-      <w:r>
-        <w:rPr>
-          <w:rFonts w:ascii="Calibri" w:hAnsi="Calibri"/>
-          <w:b w:val="0"/>
-          <w:i/>
-          <w:color w:val="2B2B2B"/>
-          <w:sz w:val="20"/>
-        </w:rPr>
-        <w:t>A-19 District Information Technology Chairperson</w:t>
-      </w:r>
-    </w:p>
-    <w:p>
-      <w:r>
-        <w:rPr>
-          <w:rFonts w:ascii="Calibri" w:hAnsi="Calibri"/>
-          <w:b/>
-          <w:i w:val="0"/>
-          <w:color w:val="003F87"/>
-          <w:sz w:val="20"/>
-        </w:rPr>
-        <w:t xml:space="preserve">  PAGE 5 · TOPIC 5  </w:t>
-      </w:r>
-    </w:p>
-    <w:p>
-      <w:r>
-        <w:rPr>
-          <w:rFonts w:ascii="Calibri" w:hAnsi="Calibri"/>
-          <w:b/>
-          <w:i w:val="0"/>
-          <w:color w:val="003F87"/>
-          <w:sz w:val="44"/>
-        </w:rPr>
-        <w:t>Social Media Promotion at Digital Platforms</w:t>
-      </w:r>
-    </w:p>
-    <w:p>
-      <w:r>
-        <w:rPr>
-          <w:rFonts w:ascii="Calibri" w:hAnsi="Calibri"/>
-          <w:b w:val="0"/>
-          <w:i/>
-          <w:color w:val="2B2B2B"/>
-          <w:sz w:val="24"/>
-        </w:rPr>
-        <w:t>Reach · Engagement · Branding of Lionism</w:t>
-      </w:r>
-    </w:p>
-    <w:p>
-      <w:pPr>
-        <w:pStyle w:val="ListBullet"/>
-      </w:pPr>
-      <w:r>
-        <w:rPr>
-          <w:rFonts w:ascii="Calibri" w:hAnsi="Calibri"/>
-          <w:b w:val="0"/>
-          <w:i w:val="0"/>
-          <w:color w:val="2B2B2B"/>
-          <w:sz w:val="22"/>
-        </w:rPr>
-        <w:t>Platforms: Facebook · Instagram · LinkedIn · YouTube · X</w:t>
-      </w:r>
-    </w:p>
-    <w:p>
-      <w:pPr>
-        <w:pStyle w:val="ListBullet"/>
-      </w:pPr>
-      <w:r>
-        <w:rPr>
-          <w:rFonts w:ascii="Calibri" w:hAnsi="Calibri"/>
-          <w:b w:val="0"/>
-          <w:i w:val="0"/>
-          <w:color w:val="2B2B2B"/>
-          <w:sz w:val="22"/>
-        </w:rPr>
-        <w:t>10,000+ combined followers — +180% YoY growth</w:t>
-      </w:r>
-    </w:p>
-    <w:p>
-      <w:pPr>
-        <w:pStyle w:val="ListBullet"/>
-      </w:pPr>
-      <w:r>
-        <w:rPr>
-          <w:rFonts w:ascii="Calibri" w:hAnsi="Calibri"/>
-          <w:b w:val="0"/>
-          <w:i w:val="0"/>
-          <w:color w:val="2B2B2B"/>
-          <w:sz w:val="22"/>
-        </w:rPr>
-        <w:t>Weekly campaign: #WeServeWednesday</w:t>
-      </w:r>
-    </w:p>
-    <w:p>
-      <w:pPr>
-        <w:pStyle w:val="ListBullet"/>
-      </w:pPr>
-      <w:r>
-        <w:rPr>
-          <w:rFonts w:ascii="Calibri" w:hAnsi="Calibri"/>
-          <w:b w:val="0"/>
-          <w:i w:val="0"/>
-          <w:color w:val="2B2B2B"/>
-          <w:sz w:val="22"/>
-        </w:rPr>
-        <w:t>Reels &amp; shorts for every major activity</w:t>
-      </w:r>
-    </w:p>
-    <w:p>
-      <w:pPr>
-        <w:pStyle w:val="ListBullet"/>
-      </w:pPr>
-      <w:r>
-        <w:rPr>
-          <w:rFonts w:ascii="Calibri" w:hAnsi="Calibri"/>
-          <w:b w:val="0"/>
-          <w:i w:val="0"/>
-          <w:color w:val="2B2B2B"/>
-          <w:sz w:val="22"/>
-        </w:rPr>
-        <w:t>Live coverage of District Convention</w:t>
-      </w:r>
-    </w:p>
-    <w:p>
-      <w:pPr>
-        <w:pStyle w:val="ListBullet"/>
-      </w:pPr>
-      <w:r>
-        <w:rPr>
-          <w:rFonts w:ascii="Calibri" w:hAnsi="Calibri"/>
-          <w:b w:val="0"/>
-          <w:i w:val="0"/>
-          <w:color w:val="2B2B2B"/>
-          <w:sz w:val="22"/>
-        </w:rPr>
-        <w:t>Bilingual content — English + regional language</w:t>
-      </w:r>
-    </w:p>
-    <w:tbl>
-      <w:tblPr>
-        <w:tblW w:type="auto" w:w="0"/>
-        <w:tblLayout w:type="fixed"/>
-        <w:tblLook w:firstColumn="1" w:firstRow="1" w:lastColumn="0" w:lastRow="0" w:noHBand="0" w:noVBand="1" w:val="04A0"/>
-      </w:tblPr>
-      <w:tblGrid>
-        <w:gridCol w:w="4713"/>
-        <w:gridCol w:w="4713"/>
-        <w:gridCol w:w="4713"/>
-      </w:tblGrid>
-      <w:tr>
-        <w:trPr>
-          <w:trHeight w:val="2835"/>
-        </w:trPr>
-        <w:tc>
-          <w:tcPr>
-            <w:tcW w:type="dxa" w:w="4724"/>
-            <w:shd w:val="clear" w:color="auto" w:fill="F4F6FA"/>
-            <w:tcBorders>
-              <w:top w:val="single" w:sz="10" w:color="003F87"/>
-              <w:left w:val="single" w:sz="10" w:color="003F87"/>
-              <w:bottom w:val="single" w:sz="10" w:color="003F87"/>
-              <w:right w:val="single" w:sz="10" w:color="003F87"/>
-            </w:tcBorders>
-            <w:vAlign w:val="center"/>
-          </w:tcPr>
-          <w:p>
-            <w:pPr>
-              <w:jc w:val="left"/>
-            </w:pPr>
-            <w:r>
-              <w:rPr>
-                <w:rFonts w:ascii="Calibri" w:hAnsi="Calibri"/>
-                <w:b/>
-                <w:i w:val="0"/>
-                <w:color w:val="003F87"/>
-                <w:sz w:val="18"/>
-              </w:rPr>
-              <w:t xml:space="preserve"> IMG 1 </w:t>
-            </w:r>
-          </w:p>
-          <w:p>
-            <w:pPr>
-              <w:jc w:val="center"/>
-            </w:pPr>
-            <w:r>
-              <w:rPr>
-                <w:rFonts w:ascii="Calibri" w:hAnsi="Calibri"/>
-                <w:b w:val="0"/>
-                <w:i/>
-                <w:color w:val="2B2B2B"/>
-                <w:sz w:val="20"/>
-              </w:rPr>
-              <w:t>[ Insert Photo ]</w:t>
-            </w:r>
-          </w:p>
-          <w:p>
-            <w:pPr>
-              <w:jc w:val="center"/>
-            </w:pPr>
-            <w:r>
-              <w:rPr>
-                <w:rFonts w:ascii="Calibri" w:hAnsi="Calibri"/>
-                <w:b/>
-                <w:i w:val="0"/>
-                <w:color w:val="003F87"/>
-                <w:sz w:val="22"/>
-              </w:rPr>
-              <w:t>Instagram</w:t>
-            </w:r>
-          </w:p>
-        </w:tc>
-        <w:tc>
-          <w:tcPr>
-            <w:tcW w:type="dxa" w:w="4724"/>
-            <w:shd w:val="clear" w:color="auto" w:fill="F4F6FA"/>
-            <w:tcBorders>
-              <w:top w:val="single" w:sz="10" w:color="003F87"/>
-              <w:left w:val="single" w:sz="10" w:color="003F87"/>
-              <w:bottom w:val="single" w:sz="10" w:color="003F87"/>
-              <w:right w:val="single" w:sz="10" w:color="003F87"/>
-            </w:tcBorders>
-            <w:vAlign w:val="center"/>
-          </w:tcPr>
-          <w:p>
-            <w:pPr>
-              <w:jc w:val="left"/>
-            </w:pPr>
-            <w:r>
-              <w:rPr>
-                <w:rFonts w:ascii="Calibri" w:hAnsi="Calibri"/>
-                <w:b/>
-                <w:i w:val="0"/>
-                <w:color w:val="003F87"/>
-                <w:sz w:val="18"/>
-              </w:rPr>
-              <w:t xml:space="preserve"> IMG 2 </w:t>
-            </w:r>
-          </w:p>
-          <w:p>
-            <w:pPr>
-              <w:jc w:val="center"/>
-            </w:pPr>
-            <w:r>
-              <w:rPr>
-                <w:rFonts w:ascii="Calibri" w:hAnsi="Calibri"/>
-                <w:b w:val="0"/>
-                <w:i/>
-                <w:color w:val="2B2B2B"/>
-                <w:sz w:val="20"/>
-              </w:rPr>
-              <w:t>[ Insert Photo ]</w:t>
-            </w:r>
-          </w:p>
-          <w:p>
-            <w:pPr>
-              <w:jc w:val="center"/>
-            </w:pPr>
-            <w:r>
-              <w:rPr>
-                <w:rFonts w:ascii="Calibri" w:hAnsi="Calibri"/>
-                <w:b/>
-                <w:i w:val="0"/>
-                <w:color w:val="003F87"/>
-                <w:sz w:val="22"/>
-              </w:rPr>
-              <w:t>Facebook</w:t>
-            </w:r>
-          </w:p>
-        </w:tc>
-        <w:tc>
-          <w:tcPr>
-            <w:tcW w:type="dxa" w:w="4724"/>
-            <w:shd w:val="clear" w:color="auto" w:fill="F4F6FA"/>
-            <w:tcBorders>
-              <w:top w:val="single" w:sz="10" w:color="003F87"/>
-              <w:left w:val="single" w:sz="10" w:color="003F87"/>
-              <w:bottom w:val="single" w:sz="10" w:color="003F87"/>
-              <w:right w:val="single" w:sz="10" w:color="003F87"/>
-            </w:tcBorders>
-            <w:vAlign w:val="center"/>
-          </w:tcPr>
-          <w:p>
-            <w:pPr>
-              <w:jc w:val="left"/>
-            </w:pPr>
-            <w:r>
-              <w:rPr>
-                <w:rFonts w:ascii="Calibri" w:hAnsi="Calibri"/>
-                <w:b/>
-                <w:i w:val="0"/>
-                <w:color w:val="003F87"/>
-                <w:sz w:val="18"/>
-              </w:rPr>
-              <w:t xml:space="preserve"> IMG 3 </w:t>
-            </w:r>
-          </w:p>
-          <w:p>
-            <w:pPr>
-              <w:jc w:val="center"/>
-            </w:pPr>
-            <w:r>
-              <w:rPr>
-                <w:rFonts w:ascii="Calibri" w:hAnsi="Calibri"/>
-                <w:b w:val="0"/>
-                <w:i/>
-                <w:color w:val="2B2B2B"/>
-                <w:sz w:val="20"/>
-              </w:rPr>
-              <w:t>[ Insert Photo ]</w:t>
-            </w:r>
-          </w:p>
-          <w:p>
-            <w:pPr>
-              <w:jc w:val="center"/>
-            </w:pPr>
-            <w:r>
-              <w:rPr>
-                <w:rFonts w:ascii="Calibri" w:hAnsi="Calibri"/>
-                <w:b/>
-                <w:i w:val="0"/>
-                <w:color w:val="003F87"/>
-                <w:sz w:val="22"/>
-              </w:rPr>
-              <w:t>LinkedIn</w:t>
-            </w:r>
-          </w:p>
-        </w:tc>
-      </w:tr>
-      <w:tr>
-        <w:trPr>
-          <w:trHeight w:val="2835"/>
-        </w:trPr>
-        <w:tc>
-          <w:tcPr>
-            <w:tcW w:type="dxa" w:w="4724"/>
-            <w:shd w:val="clear" w:color="auto" w:fill="F4F6FA"/>
-            <w:tcBorders>
-              <w:top w:val="single" w:sz="10" w:color="003F87"/>
-              <w:left w:val="single" w:sz="10" w:color="003F87"/>
-              <w:bottom w:val="single" w:sz="10" w:color="003F87"/>
-              <w:right w:val="single" w:sz="10" w:color="003F87"/>
-            </w:tcBorders>
-            <w:vAlign w:val="center"/>
-          </w:tcPr>
-          <w:p>
-            <w:pPr>
-              <w:jc w:val="left"/>
-            </w:pPr>
-            <w:r>
-              <w:rPr>
-                <w:rFonts w:ascii="Calibri" w:hAnsi="Calibri"/>
-                <w:b/>
-                <w:i w:val="0"/>
-                <w:color w:val="003F87"/>
-                <w:sz w:val="18"/>
-              </w:rPr>
-              <w:t xml:space="preserve"> IMG 4 </w:t>
-            </w:r>
-          </w:p>
-          <w:p>
-            <w:pPr>
-              <w:jc w:val="center"/>
-            </w:pPr>
-            <w:r>
-              <w:rPr>
-                <w:rFonts w:ascii="Calibri" w:hAnsi="Calibri"/>
-                <w:b w:val="0"/>
-                <w:i/>
-                <w:color w:val="2B2B2B"/>
-                <w:sz w:val="20"/>
-              </w:rPr>
-              <w:t>[ Insert Photo ]</w:t>
-            </w:r>
-          </w:p>
-          <w:p>
-            <w:pPr>
-              <w:jc w:val="center"/>
-            </w:pPr>
-            <w:r>
-              <w:rPr>
-                <w:rFonts w:ascii="Calibri" w:hAnsi="Calibri"/>
-                <w:b/>
-                <w:i w:val="0"/>
-                <w:color w:val="003F87"/>
-                <w:sz w:val="22"/>
-              </w:rPr>
-              <w:t>YouTube Reel</w:t>
-            </w:r>
-          </w:p>
-        </w:tc>
-        <w:tc>
-          <w:tcPr>
-            <w:tcW w:type="dxa" w:w="4724"/>
-            <w:shd w:val="clear" w:color="auto" w:fill="F4F6FA"/>
-            <w:tcBorders>
-              <w:top w:val="single" w:sz="10" w:color="003F87"/>
-              <w:left w:val="single" w:sz="10" w:color="003F87"/>
-              <w:bottom w:val="single" w:sz="10" w:color="003F87"/>
-              <w:right w:val="single" w:sz="10" w:color="003F87"/>
-            </w:tcBorders>
-            <w:vAlign w:val="center"/>
-          </w:tcPr>
-          <w:p>
-            <w:pPr>
-              <w:jc w:val="left"/>
-            </w:pPr>
-            <w:r>
-              <w:rPr>
-                <w:rFonts w:ascii="Calibri" w:hAnsi="Calibri"/>
-                <w:b/>
-                <w:i w:val="0"/>
-                <w:color w:val="003F87"/>
-                <w:sz w:val="18"/>
-              </w:rPr>
-              <w:t xml:space="preserve"> IMG 5 </w:t>
-            </w:r>
-          </w:p>
-          <w:p>
-            <w:pPr>
-              <w:jc w:val="center"/>
-            </w:pPr>
-            <w:r>
-              <w:rPr>
-                <w:rFonts w:ascii="Calibri" w:hAnsi="Calibri"/>
-                <w:b w:val="0"/>
-                <w:i/>
-                <w:color w:val="2B2B2B"/>
-                <w:sz w:val="20"/>
-              </w:rPr>
-              <w:t>[ Insert Photo ]</w:t>
-            </w:r>
-          </w:p>
-          <w:p>
-            <w:pPr>
-              <w:jc w:val="center"/>
-            </w:pPr>
-            <w:r>
-              <w:rPr>
-                <w:rFonts w:ascii="Calibri" w:hAnsi="Calibri"/>
-                <w:b/>
-                <w:i w:val="0"/>
-                <w:color w:val="003F87"/>
-                <w:sz w:val="22"/>
-              </w:rPr>
-              <w:t>Convention Live</w:t>
-            </w:r>
-          </w:p>
-        </w:tc>
-        <w:tc>
-          <w:tcPr>
-            <w:tcW w:type="dxa" w:w="4724"/>
-            <w:shd w:val="clear" w:color="auto" w:fill="F4F6FA"/>
-            <w:tcBorders>
-              <w:top w:val="single" w:sz="10" w:color="003F87"/>
-              <w:left w:val="single" w:sz="10" w:color="003F87"/>
-              <w:bottom w:val="single" w:sz="10" w:color="003F87"/>
-              <w:right w:val="single" w:sz="10" w:color="003F87"/>
-            </w:tcBorders>
-            <w:vAlign w:val="center"/>
-          </w:tcPr>
-          <w:p>
-            <w:pPr>
-              <w:jc w:val="left"/>
-            </w:pPr>
-            <w:r>
-              <w:rPr>
-                <w:rFonts w:ascii="Calibri" w:hAnsi="Calibri"/>
-                <w:b/>
-                <w:i w:val="0"/>
-                <w:color w:val="003F87"/>
-                <w:sz w:val="18"/>
-              </w:rPr>
-              <w:t xml:space="preserve"> IMG 6 </w:t>
-            </w:r>
-          </w:p>
-          <w:p>
-            <w:pPr>
-              <w:jc w:val="center"/>
-            </w:pPr>
-            <w:r>
-              <w:rPr>
-                <w:rFonts w:ascii="Calibri" w:hAnsi="Calibri"/>
-                <w:b w:val="0"/>
-                <w:i/>
-                <w:color w:val="2B2B2B"/>
-                <w:sz w:val="20"/>
-              </w:rPr>
-              <w:t>[ Insert Photo ]</w:t>
-            </w:r>
-          </w:p>
-          <w:p>
-            <w:pPr>
-              <w:jc w:val="center"/>
-            </w:pPr>
-            <w:r>
-              <w:rPr>
-                <w:rFonts w:ascii="Calibri" w:hAnsi="Calibri"/>
-                <w:b/>
-                <w:i w:val="0"/>
-                <w:color w:val="003F87"/>
-                <w:sz w:val="22"/>
-              </w:rPr>
-              <w:t>Hashtag Campaign</w:t>
-            </w:r>
-          </w:p>
-        </w:tc>
-      </w:tr>
-    </w:tbl>
-    <w:p>
-      <w:pPr>
-        <w:jc w:val="center"/>
-      </w:pPr>
-      <w:r>
-        <w:rPr>
-          <w:rFonts w:ascii="Calibri" w:hAnsi="Calibri"/>
-          <w:b/>
-          <w:i w:val="0"/>
-          <w:color w:val="003F87"/>
-          <w:sz w:val="20"/>
-        </w:rPr>
-        <w:t>We Serve — Powered by Technology   ·   5 / 6</w:t>
-      </w:r>
-    </w:p>
-    <w:p>
-      <w:r>
-        <w:br w:type="page"/>
-      </w:r>
-    </w:p>
-    <w:tbl>
-      <w:tblPr>
-        <w:tblW w:type="auto" w:w="0"/>
-        <w:tblLayout w:type="fixed"/>
-        <w:tblLook w:firstColumn="1" w:firstRow="1" w:lastColumn="0" w:lastRow="0" w:noHBand="0" w:noVBand="1" w:val="04A0"/>
-      </w:tblPr>
-      <w:tblGrid>
-        <w:gridCol w:w="7070"/>
-        <w:gridCol w:w="7070"/>
-      </w:tblGrid>
-      <w:tr>
-        <w:tc>
-          <w:tcPr>
-            <w:tcW w:type="dxa" w:w="7087"/>
-            <w:shd w:val="clear" w:color="auto" w:fill="003F87"/>
-            <w:tcBorders>
-              <w:top w:val="single" w:sz="12" w:color="FFC72C"/>
-              <w:left w:val="single" w:sz="12" w:color="FFC72C"/>
-              <w:bottom w:val="single" w:sz="12" w:color="FFC72C"/>
-              <w:right w:val="single" w:sz="12" w:color="FFC72C"/>
-            </w:tcBorders>
-            <w:vAlign w:val="center"/>
-          </w:tcPr>
-          <w:p>
-            <w:pPr>
-              <w:jc w:val="center"/>
-            </w:pPr>
-            <w:r>
-              <w:rPr>
-                <w:rFonts w:ascii="Calibri" w:hAnsi="Calibri"/>
-                <w:b/>
-                <w:i w:val="0"/>
-                <w:color w:val="FFFFFF"/>
-                <w:sz w:val="28"/>
-              </w:rPr>
-              <w:t>DIST 3232F1</w:t>
-            </w:r>
-          </w:p>
-        </w:tc>
-        <w:tc>
-          <w:tcPr>
-            <w:tcW w:type="dxa" w:w="7087"/>
-            <w:shd w:val="clear" w:color="auto" w:fill="003F87"/>
-            <w:tcBorders>
-              <w:top w:val="single" w:sz="12" w:color="FFC72C"/>
-              <w:left w:val="single" w:sz="12" w:color="FFC72C"/>
-              <w:bottom w:val="single" w:sz="12" w:color="FFC72C"/>
-              <w:right w:val="single" w:sz="12" w:color="FFC72C"/>
-            </w:tcBorders>
-            <w:vAlign w:val="center"/>
-          </w:tcPr>
-          <w:p>
-            <w:pPr>
-              <w:jc w:val="center"/>
-            </w:pPr>
-            <w:r>
-              <w:rPr>
-                <w:rFonts w:ascii="Calibri" w:hAnsi="Calibri"/>
-                <w:b/>
-                <w:i w:val="0"/>
-                <w:color w:val="FFFFFF"/>
-                <w:sz w:val="28"/>
-              </w:rPr>
-              <w:t>LCI</w:t>
-            </w:r>
-          </w:p>
-        </w:tc>
-      </w:tr>
-    </w:tbl>
-    <w:p>
-      <w:pPr>
-        <w:jc w:val="center"/>
-      </w:pPr>
-      <w:r>
-        <w:rPr>
-          <w:rFonts w:ascii="Calibri" w:hAnsi="Calibri"/>
-          <w:b/>
-          <w:i w:val="0"/>
-          <w:color w:val="003F87"/>
-          <w:sz w:val="24"/>
-        </w:rPr>
-        <w:t>LIONS INTERNATIONAL · DISTRICT 3232F1</w:t>
-      </w:r>
-    </w:p>
-    <w:p>
-      <w:pPr>
-        <w:jc w:val="center"/>
-      </w:pPr>
-      <w:r>
-        <w:rPr>
-          <w:rFonts w:ascii="Calibri" w:hAnsi="Calibri"/>
-          <w:b w:val="0"/>
-          <w:i/>
-          <w:color w:val="2B2B2B"/>
-          <w:sz w:val="20"/>
-        </w:rPr>
-        <w:t>A-19 District Information Technology Chairperson</w:t>
-      </w:r>
-    </w:p>
-    <w:p>
-      <w:r>
-        <w:rPr>
-          <w:rFonts w:ascii="Calibri" w:hAnsi="Calibri"/>
-          <w:b/>
-          <w:i w:val="0"/>
-          <w:color w:val="003F87"/>
-          <w:sz w:val="20"/>
-        </w:rPr>
-        <w:t xml:space="preserve">  PAGE 6 · TOPIC 6  </w:t>
-      </w:r>
-    </w:p>
-    <w:p>
-      <w:r>
-        <w:rPr>
-          <w:rFonts w:ascii="Calibri" w:hAnsi="Calibri"/>
-          <w:b/>
-          <w:i w:val="0"/>
-          <w:color w:val="003F87"/>
-          <w:sz w:val="44"/>
-        </w:rPr>
-        <w:t>Achievements During the Year</w:t>
-      </w:r>
-    </w:p>
-    <w:p>
-      <w:r>
-        <w:rPr>
-          <w:rFonts w:ascii="Calibri" w:hAnsi="Calibri"/>
-          <w:b w:val="0"/>
-          <w:i/>
-          <w:color w:val="2B2B2B"/>
-          <w:sz w:val="24"/>
-        </w:rPr>
-        <w:t>Impact · Growth · Recognition</w:t>
-      </w:r>
-    </w:p>
-    <w:p>
-      <w:pPr>
-        <w:pStyle w:val="ListBullet"/>
-      </w:pPr>
-      <w:r>
-        <w:rPr>
-          <w:rFonts w:ascii="Calibri" w:hAnsi="Calibri"/>
-          <w:b w:val="0"/>
-          <w:i w:val="0"/>
-          <w:color w:val="2B2B2B"/>
-          <w:sz w:val="22"/>
-        </w:rPr>
-        <w:t>100% MMR compliance for 8 consecutive months</w:t>
-      </w:r>
-    </w:p>
-    <w:p>
-      <w:pPr>
-        <w:pStyle w:val="ListBullet"/>
-      </w:pPr>
-      <w:r>
-        <w:rPr>
-          <w:rFonts w:ascii="Calibri" w:hAnsi="Calibri"/>
-          <w:b w:val="0"/>
-          <w:i w:val="0"/>
-          <w:color w:val="2B2B2B"/>
-          <w:sz w:val="22"/>
-        </w:rPr>
-        <w:t>50+ club websites launched under district umbrella</w:t>
-      </w:r>
-    </w:p>
-    <w:p>
-      <w:pPr>
-        <w:pStyle w:val="ListBullet"/>
-      </w:pPr>
-      <w:r>
-        <w:rPr>
-          <w:rFonts w:ascii="Calibri" w:hAnsi="Calibri"/>
-          <w:b w:val="0"/>
-          <w:i w:val="0"/>
-          <w:color w:val="2B2B2B"/>
-          <w:sz w:val="22"/>
-        </w:rPr>
-        <w:t>₹50L+ donations processed online — full audit trail</w:t>
-      </w:r>
-    </w:p>
-    <w:p>
-      <w:pPr>
-        <w:pStyle w:val="ListBullet"/>
-      </w:pPr>
-      <w:r>
-        <w:rPr>
-          <w:rFonts w:ascii="Calibri" w:hAnsi="Calibri"/>
-          <w:b w:val="0"/>
-          <w:i w:val="0"/>
-          <w:color w:val="2B2B2B"/>
-          <w:sz w:val="22"/>
-        </w:rPr>
-        <w:t>5,000+ service hours digitally logged on MyLion</w:t>
-      </w:r>
-    </w:p>
-    <w:p>
-      <w:pPr>
-        <w:pStyle w:val="ListBullet"/>
-      </w:pPr>
-      <w:r>
-        <w:rPr>
-          <w:rFonts w:ascii="Calibri" w:hAnsi="Calibri"/>
-          <w:b w:val="0"/>
-          <w:i w:val="0"/>
-          <w:color w:val="2B2B2B"/>
-          <w:sz w:val="22"/>
-        </w:rPr>
-        <w:t>Recognised at MD 3232 IT Forum</w:t>
-      </w:r>
-    </w:p>
-    <w:p>
-      <w:pPr>
-        <w:pStyle w:val="ListBullet"/>
-      </w:pPr>
-      <w:r>
-        <w:rPr>
-          <w:rFonts w:ascii="Calibri" w:hAnsi="Calibri"/>
-          <w:b w:val="0"/>
-          <w:i w:val="0"/>
-          <w:color w:val="2B2B2B"/>
-          <w:sz w:val="22"/>
-        </w:rPr>
-        <w:t>District benefits: transparency · faster comms · trust</w:t>
-      </w:r>
-    </w:p>
-    <w:tbl>
-      <w:tblPr>
-        <w:tblW w:type="auto" w:w="0"/>
-        <w:tblLayout w:type="fixed"/>
-        <w:tblLook w:firstColumn="1" w:firstRow="1" w:lastColumn="0" w:lastRow="0" w:noHBand="0" w:noVBand="1" w:val="04A0"/>
-      </w:tblPr>
-      <w:tblGrid>
-        <w:gridCol w:w="4713"/>
-        <w:gridCol w:w="4713"/>
-        <w:gridCol w:w="4713"/>
-      </w:tblGrid>
-      <w:tr>
-        <w:trPr>
-          <w:trHeight w:val="2835"/>
-        </w:trPr>
-        <w:tc>
-          <w:tcPr>
-            <w:tcW w:type="dxa" w:w="4724"/>
-            <w:shd w:val="clear" w:color="auto" w:fill="F4F6FA"/>
-            <w:tcBorders>
-              <w:top w:val="single" w:sz="10" w:color="003F87"/>
-              <w:left w:val="single" w:sz="10" w:color="003F87"/>
-              <w:bottom w:val="single" w:sz="10" w:color="003F87"/>
-              <w:right w:val="single" w:sz="10" w:color="003F87"/>
-            </w:tcBorders>
-            <w:vAlign w:val="center"/>
-          </w:tcPr>
-          <w:p>
-            <w:pPr>
-              <w:jc w:val="left"/>
-            </w:pPr>
-            <w:r>
-              <w:rPr>
-                <w:rFonts w:ascii="Calibri" w:hAnsi="Calibri"/>
-                <w:b/>
-                <w:i w:val="0"/>
-                <w:color w:val="003F87"/>
-                <w:sz w:val="18"/>
-              </w:rPr>
-              <w:t xml:space="preserve"> IMG 1 </w:t>
-            </w:r>
-          </w:p>
-          <w:p>
-            <w:pPr>
-              <w:jc w:val="center"/>
-            </w:pPr>
-            <w:r>
-              <w:rPr>
-                <w:rFonts w:ascii="Calibri" w:hAnsi="Calibri"/>
-                <w:b w:val="0"/>
-                <w:i/>
-                <w:color w:val="2B2B2B"/>
-                <w:sz w:val="20"/>
-              </w:rPr>
-              <w:t>[ Insert Photo ]</w:t>
-            </w:r>
-          </w:p>
-          <w:p>
-            <w:pPr>
-              <w:jc w:val="center"/>
-            </w:pPr>
-            <w:r>
-              <w:rPr>
-                <w:rFonts w:ascii="Calibri" w:hAnsi="Calibri"/>
-                <w:b/>
-                <w:i w:val="0"/>
-                <w:color w:val="003F87"/>
-                <w:sz w:val="22"/>
-              </w:rPr>
-              <w:t>Award Moment</w:t>
-            </w:r>
-          </w:p>
-        </w:tc>
-        <w:tc>
-          <w:tcPr>
-            <w:tcW w:type="dxa" w:w="4724"/>
-            <w:shd w:val="clear" w:color="auto" w:fill="F4F6FA"/>
-            <w:tcBorders>
-              <w:top w:val="single" w:sz="10" w:color="003F87"/>
-              <w:left w:val="single" w:sz="10" w:color="003F87"/>
-              <w:bottom w:val="single" w:sz="10" w:color="003F87"/>
-              <w:right w:val="single" w:sz="10" w:color="003F87"/>
-            </w:tcBorders>
-            <w:vAlign w:val="center"/>
-          </w:tcPr>
-          <w:p>
-            <w:pPr>
-              <w:jc w:val="left"/>
-            </w:pPr>
-            <w:r>
-              <w:rPr>
-                <w:rFonts w:ascii="Calibri" w:hAnsi="Calibri"/>
-                <w:b/>
-                <w:i w:val="0"/>
-                <w:color w:val="003F87"/>
-                <w:sz w:val="18"/>
-              </w:rPr>
-              <w:t xml:space="preserve"> IMG 2 </w:t>
-            </w:r>
-          </w:p>
-          <w:p>
-            <w:pPr>
-              <w:jc w:val="center"/>
-            </w:pPr>
-            <w:r>
-              <w:rPr>
-                <w:rFonts w:ascii="Calibri" w:hAnsi="Calibri"/>
-                <w:b w:val="0"/>
-                <w:i/>
-                <w:color w:val="2B2B2B"/>
-                <w:sz w:val="20"/>
-              </w:rPr>
-              <w:t>[ Insert Photo ]</w:t>
-            </w:r>
-          </w:p>
-          <w:p>
-            <w:pPr>
-              <w:jc w:val="center"/>
-            </w:pPr>
-            <w:r>
-              <w:rPr>
-                <w:rFonts w:ascii="Calibri" w:hAnsi="Calibri"/>
-                <w:b/>
-                <w:i w:val="0"/>
-                <w:color w:val="003F87"/>
-                <w:sz w:val="22"/>
-              </w:rPr>
-              <w:t>Convention Stage</w:t>
-            </w:r>
-          </w:p>
-        </w:tc>
-        <w:tc>
-          <w:tcPr>
-            <w:tcW w:type="dxa" w:w="4724"/>
-            <w:shd w:val="clear" w:color="auto" w:fill="F4F6FA"/>
-            <w:tcBorders>
-              <w:top w:val="single" w:sz="10" w:color="003F87"/>
-              <w:left w:val="single" w:sz="10" w:color="003F87"/>
-              <w:bottom w:val="single" w:sz="10" w:color="003F87"/>
-              <w:right w:val="single" w:sz="10" w:color="003F87"/>
-            </w:tcBorders>
-            <w:vAlign w:val="center"/>
-          </w:tcPr>
-          <w:p>
-            <w:pPr>
-              <w:jc w:val="left"/>
-            </w:pPr>
-            <w:r>
-              <w:rPr>
-                <w:rFonts w:ascii="Calibri" w:hAnsi="Calibri"/>
-                <w:b/>
-                <w:i w:val="0"/>
-                <w:color w:val="003F87"/>
-                <w:sz w:val="18"/>
-              </w:rPr>
-              <w:t xml:space="preserve"> IMG 3 </w:t>
-            </w:r>
-          </w:p>
-          <w:p>
-            <w:pPr>
-              <w:jc w:val="center"/>
-            </w:pPr>
-            <w:r>
-              <w:rPr>
-                <w:rFonts w:ascii="Calibri" w:hAnsi="Calibri"/>
-                <w:b w:val="0"/>
-                <w:i/>
-                <w:color w:val="2B2B2B"/>
-                <w:sz w:val="20"/>
-              </w:rPr>
-              <w:t>[ Insert Photo ]</w:t>
-            </w:r>
-          </w:p>
-          <w:p>
-            <w:pPr>
-              <w:jc w:val="center"/>
-            </w:pPr>
-            <w:r>
-              <w:rPr>
-                <w:rFonts w:ascii="Calibri" w:hAnsi="Calibri"/>
-                <w:b/>
-                <w:i w:val="0"/>
-                <w:color w:val="003F87"/>
-                <w:sz w:val="22"/>
-              </w:rPr>
-              <w:t>Certificate</w:t>
-            </w:r>
-          </w:p>
-        </w:tc>
-      </w:tr>
-      <w:tr>
-        <w:trPr>
-          <w:trHeight w:val="2835"/>
-        </w:trPr>
-        <w:tc>
-          <w:tcPr>
-            <w:tcW w:type="dxa" w:w="4724"/>
-            <w:shd w:val="clear" w:color="auto" w:fill="F4F6FA"/>
-            <w:tcBorders>
-              <w:top w:val="single" w:sz="10" w:color="003F87"/>
-              <w:left w:val="single" w:sz="10" w:color="003F87"/>
-              <w:bottom w:val="single" w:sz="10" w:color="003F87"/>
-              <w:right w:val="single" w:sz="10" w:color="003F87"/>
-            </w:tcBorders>
-            <w:vAlign w:val="center"/>
-          </w:tcPr>
-          <w:p>
-            <w:pPr>
-              <w:jc w:val="left"/>
-            </w:pPr>
-            <w:r>
-              <w:rPr>
-                <w:rFonts w:ascii="Calibri" w:hAnsi="Calibri"/>
-                <w:b/>
-                <w:i w:val="0"/>
-                <w:color w:val="003F87"/>
-                <w:sz w:val="18"/>
-              </w:rPr>
-              <w:t xml:space="preserve"> IMG 4 </w:t>
-            </w:r>
-          </w:p>
-          <w:p>
-            <w:pPr>
-              <w:jc w:val="center"/>
-            </w:pPr>
-            <w:r>
-              <w:rPr>
-                <w:rFonts w:ascii="Calibri" w:hAnsi="Calibri"/>
-                <w:b w:val="0"/>
-                <w:i/>
-                <w:color w:val="2B2B2B"/>
-                <w:sz w:val="20"/>
-              </w:rPr>
-              <w:t>[ Insert Photo ]</w:t>
-            </w:r>
-          </w:p>
-          <w:p>
-            <w:pPr>
-              <w:jc w:val="center"/>
-            </w:pPr>
-            <w:r>
-              <w:rPr>
-                <w:rFonts w:ascii="Calibri" w:hAnsi="Calibri"/>
-                <w:b/>
-                <w:i w:val="0"/>
-                <w:color w:val="003F87"/>
-                <w:sz w:val="22"/>
-              </w:rPr>
-              <w:t>Metrics Dashboard</w:t>
-            </w:r>
-          </w:p>
-        </w:tc>
-        <w:tc>
-          <w:tcPr>
-            <w:tcW w:type="dxa" w:w="4724"/>
-            <w:shd w:val="clear" w:color="auto" w:fill="F4F6FA"/>
-            <w:tcBorders>
-              <w:top w:val="single" w:sz="10" w:color="003F87"/>
-              <w:left w:val="single" w:sz="10" w:color="003F87"/>
-              <w:bottom w:val="single" w:sz="10" w:color="003F87"/>
-              <w:right w:val="single" w:sz="10" w:color="003F87"/>
-            </w:tcBorders>
-            <w:vAlign w:val="center"/>
-          </w:tcPr>
-          <w:p>
-            <w:pPr>
-              <w:jc w:val="left"/>
-            </w:pPr>
-            <w:r>
-              <w:rPr>
-                <w:rFonts w:ascii="Calibri" w:hAnsi="Calibri"/>
-                <w:b/>
-                <w:i w:val="0"/>
-                <w:color w:val="003F87"/>
-                <w:sz w:val="18"/>
-              </w:rPr>
-              <w:t xml:space="preserve"> IMG 5 </w:t>
-            </w:r>
-          </w:p>
-          <w:p>
-            <w:pPr>
-              <w:jc w:val="center"/>
-            </w:pPr>
-            <w:r>
-              <w:rPr>
-                <w:rFonts w:ascii="Calibri" w:hAnsi="Calibri"/>
-                <w:b w:val="0"/>
-                <w:i/>
-                <w:color w:val="2B2B2B"/>
-                <w:sz w:val="20"/>
-              </w:rPr>
-              <w:t>[ Insert Photo ]</w:t>
-            </w:r>
-          </w:p>
-          <w:p>
-            <w:pPr>
-              <w:jc w:val="center"/>
-            </w:pPr>
-            <w:r>
-              <w:rPr>
-                <w:rFonts w:ascii="Calibri" w:hAnsi="Calibri"/>
-                <w:b/>
-                <w:i w:val="0"/>
-                <w:color w:val="003F87"/>
-                <w:sz w:val="22"/>
-              </w:rPr>
-              <w:t>Milestone Post</w:t>
-            </w:r>
-          </w:p>
-        </w:tc>
-        <w:tc>
-          <w:tcPr>
-            <w:tcW w:type="dxa" w:w="4724"/>
-            <w:shd w:val="clear" w:color="auto" w:fill="F4F6FA"/>
-            <w:tcBorders>
-              <w:top w:val="single" w:sz="10" w:color="003F87"/>
-              <w:left w:val="single" w:sz="10" w:color="003F87"/>
-              <w:bottom w:val="single" w:sz="10" w:color="003F87"/>
-              <w:right w:val="single" w:sz="10" w:color="003F87"/>
-            </w:tcBorders>
-            <w:vAlign w:val="center"/>
-          </w:tcPr>
-          <w:p>
-            <w:pPr>
-              <w:jc w:val="left"/>
-            </w:pPr>
-            <w:r>
-              <w:rPr>
-                <w:rFonts w:ascii="Calibri" w:hAnsi="Calibri"/>
-                <w:b/>
-                <w:i w:val="0"/>
-                <w:color w:val="003F87"/>
-                <w:sz w:val="18"/>
-              </w:rPr>
-              <w:t xml:space="preserve"> IMG 6 </w:t>
-            </w:r>
-          </w:p>
-          <w:p>
-            <w:pPr>
-              <w:jc w:val="center"/>
-            </w:pPr>
-            <w:r>
-              <w:rPr>
-                <w:rFonts w:ascii="Calibri" w:hAnsi="Calibri"/>
-                <w:b w:val="0"/>
-                <w:i/>
-                <w:color w:val="2B2B2B"/>
-                <w:sz w:val="20"/>
-              </w:rPr>
-              <w:t>[ Insert Photo ]</w:t>
-            </w:r>
-          </w:p>
-          <w:p>
-            <w:pPr>
-              <w:jc w:val="center"/>
-            </w:pPr>
-            <w:r>
-              <w:rPr>
-                <w:rFonts w:ascii="Calibri" w:hAnsi="Calibri"/>
-                <w:b/>
-                <w:i w:val="0"/>
-                <w:color w:val="003F87"/>
-                <w:sz w:val="22"/>
-              </w:rPr>
-              <w:t>Press Feature</w:t>
-            </w:r>
-          </w:p>
-        </w:tc>
-      </w:tr>
-    </w:tbl>
-    <w:p>
-      <w:pPr>
-        <w:jc w:val="center"/>
-      </w:pPr>
-      <w:r>
-        <w:rPr>
-          <w:rFonts w:ascii="Calibri" w:hAnsi="Calibri"/>
-          <w:b/>
-          <w:i w:val="0"/>
-          <w:color w:val="003F87"/>
-          <w:sz w:val="20"/>
-        </w:rPr>
-        <w:t>We Serve — Powered by Technology   ·   6 / 6</w:t>
+        <w:drawing>
+          <wp:inline xmlns:a="http://schemas.openxmlformats.org/drawingml/2006/main" xmlns:pic="http://schemas.openxmlformats.org/drawingml/2006/picture">
+            <wp:extent cx="7200900" cy="10178776"/>
+            <wp:docPr id="6" name="Picture 6"/>
+            <wp:cNvGraphicFramePr>
+              <a:graphicFrameLocks noChangeAspect="1"/>
+            </wp:cNvGraphicFramePr>
+            <a:graphic>
+              <a:graphicData uri="http://schemas.openxmlformats.org/drawingml/2006/picture">
+                <pic:pic>
+                  <pic:nvPicPr>
+                    <pic:cNvPr id="0" name="page_06.png"/>
+                    <pic:cNvPicPr/>
+                  </pic:nvPicPr>
+                  <pic:blipFill>
+                    <a:blip r:embed="rId14"/>
+                    <a:stretch>
+                      <a:fillRect/>
+                    </a:stretch>
+                  </pic:blipFill>
+                  <pic:spPr>
+                    <a:xfrm>
+                      <a:off x="0" y="0"/>
+                      <a:ext cx="7200900" cy="10178776"/>
+                    </a:xfrm>
+                    <a:prstGeom prst="rect"/>
+                  </pic:spPr>
+                </pic:pic>
+              </a:graphicData>
+            </a:graphic>
+          </wp:inline>
+        </w:drawing>
       </w:r>
     </w:p>
     <w:sectPr>
-      <w:footerReference w:type="default" r:id="rId9"/>
-      <w:pgSz w:w="15840" w:h="12240" w:orient="landscape"/>
-      <w:pgMar w:top="680" w:right="850" w:bottom="680" w:left="850" w:header="720" w:footer="720" w:gutter="0"/>
+      <w:pgSz w:w="11906" w:h="16838"/>
+      <w:pgMar w:top="283" w:right="283" w:bottom="283" w:left="283" w:header="720" w:footer="720" w:gutter="0"/>
       <w:cols w:space="720"/>
       <w:docGrid w:linePitch="360"/>
     </w:sectPr>
   </w:body>
 </w:document>
-</file>
-
-<file path=word/footer1.xml><?xml version="1.0" encoding="utf-8"?>
-<w:ftr xmlns:m="http://schemas.openxmlformats.org/officeDocument/2006/math" xmlns:mc="http://schemas.openxmlformats.org/markup-compatibility/2006" xmlns:mo="http://schemas.microsoft.com/office/mac/office/2008/main" xmlns:mv="urn:schemas-microsoft-com:mac:vml" xmlns:o="urn:schemas-microsoft-com:office:office" xmlns:r="http://schemas.openxmlformats.org/officeDocument/2006/relationships" xmlns:v="urn:schemas-microsoft-com:vml" xmlns:w10="urn:schemas-microsoft-com:office:word" xmlns:w14="http://schemas.microsoft.com/office/word/2010/wordml" xmlns:w="http://schemas.openxmlformats.org/wordprocessingml/2006/main" xmlns:wne="http://schemas.microsoft.com/office/word/2006/wordml" xmlns:wp14="http://schemas.microsoft.com/office/word/2010/wordprocessingDrawing" xmlns:wp="http://schemas.openxmlformats.org/drawingml/2006/wordprocessingDrawing" xmlns:wpc="http://schemas.microsoft.com/office/word/2010/wordprocessingCanvas" xmlns:wpg="http://schemas.microsoft.com/office/word/2010/wordprocessingGroup" xmlns:wpi="http://schemas.microsoft.com/office/word/2010/wordprocessingInk" xmlns:wps="http://schemas.microsoft.com/office/word/2010/wordprocessingShape" mc:Ignorable="w14 wp14">
-  <w:p>
-    <w:pPr>
-      <w:pStyle w:val="Footer"/>
-      <w:jc w:val="center"/>
-    </w:pPr>
-    <w:r>
-      <w:rPr>
-        <w:rFonts w:ascii="Calibri" w:hAnsi="Calibri"/>
-        <w:b/>
-        <w:i w:val="0"/>
-        <w:color w:val="003F87"/>
-        <w:sz w:val="20"/>
-      </w:rPr>
-      <w:t>We Serve — Powered by Technology</w:t>
-    </w:r>
-  </w:p>
-</w:ftr>
 </file>
 
 <file path=word/numbering.xml><?xml version="1.0" encoding="utf-8"?>
@@ -4241,6 +630,9 @@
     <w:name w:val="Normal"/>
     <w:qFormat/>
     <w:rsid w:val="00FC693F"/>
+    <w:pPr>
+      <w:spacing w:before="0" w:after="0" w:line="240" w:lineRule="auto"/>
+    </w:pPr>
   </w:style>
   <w:style w:type="paragraph" w:styleId="Header">
     <w:name w:val="header"/>

</xml_diff>